<commit_message>
feat: production-ready site with SEO, security headers and benchmark page (0.3.3)
- SEO: metadata, canonical, Open Graph/Twitter images, sitemap, robots, manifest, JSON-LD
- Security: CSP, HSTS, frame/nosniff/referrer/permissions/COOP/CORP headers, security.txt; Next 16.4 (0 npm audit findings)
- Accessibility and resilience: skip link, focus rings, reduced motion, 404/error pages
- Fix hero bridge (round nodes, undistorted labels, fits short windows, wipe reveal) and overlapping step numbers
- Add /benchmark report page and report downloads; show vertical video and extra motion on phones
- Show the tool version from a single constant
</commit_message>
<xml_diff>
--- a/public/ContextBridge-Benchmark-Report.docx
+++ b/public/ContextBridge-Benchmark-Report.docx
@@ -209,7 +209,7 @@
                 <w:sz w:val="18"/>
                 <w:szCs w:val="18"/>
               </w:rPr>
-              <w:t xml:space="preserve">0.3.2 (commit 30c2b62)</w:t>
+              <w:t xml:space="preserve">0.3.3 (commit 30c2b62 + working tree)</w:t>
             </w:r>
           </w:p>
         </w:tc>
@@ -668,7 +668,7 @@
                 <w:sz w:val="18"/>
                 <w:szCs w:val="18"/>
               </w:rPr>
-              <w:t xml:space="preserve">84 of 86 labeled scenarios return the expected verdict. 2 misses (listed in section 1).</w:t>
+              <w:t xml:space="preserve">85 of 86 labeled scenarios return the expected verdict. 1 miss (listed in section 1).</w:t>
             </w:r>
           </w:p>
         </w:tc>
@@ -810,7 +810,7 @@
                 <w:sz w:val="18"/>
                 <w:szCs w:val="18"/>
               </w:rPr>
-              <w:t xml:space="preserve">resume --check: median 65 tokens (p90 172). Full resume: median 468 (p90 539). Stays flat as projects grow because the handoff is capped.</w:t>
+              <w:t xml:space="preserve">resume --check: median 65 tokens (p90 114). Full resume: median 468.5 (p90 537). Stays flat as projects grow because the handoff is capped.</w:t>
             </w:r>
           </w:p>
         </w:tc>
@@ -881,7 +881,7 @@
                 <w:sz w:val="18"/>
                 <w:szCs w:val="18"/>
               </w:rPr>
-              <w:t xml:space="preserve">132 ms to check 10,000 files with 500 uncommitted changes (about 62 ms is Python startup).</w:t>
+              <w:t xml:space="preserve">143 ms to check 10,000 files with 500 uncommitted changes (about 40 ms is Python startup).</w:t>
             </w:r>
           </w:p>
         </w:tc>
@@ -952,7 +952,7 @@
                 <w:sz w:val="18"/>
                 <w:szCs w:val="18"/>
               </w:rPr>
-              <w:t xml:space="preserve">100% recall on 24 covered formats (1,000 samples each); 0% on 9 uncovered formats; 24 false positives in 979,577 lines of Python stdlib.</w:t>
+              <w:t xml:space="preserve">100% recall on 31 covered formats (1,000 samples each); 0% on 5 uncovered formats; 10 false positives in 979,577 lines of Python stdlib.</w:t>
             </w:r>
           </w:p>
         </w:tc>
@@ -1023,78 +1023,7 @@
                 <w:sz w:val="18"/>
                 <w:szCs w:val="18"/>
               </w:rPr>
-              <w:t xml:space="preserve">Test suite passed 15 of 15 repeated runs; passes on Python 3.11.13 and 3.14.6. Concurrent writers lose evidence (finding N1).</w:t>
-            </w:r>
-          </w:p>
-        </w:tc>
-      </w:tr>
-      <w:tr>
-        <w:trPr>
-          <w:cantSplit/>
-        </w:trPr>
-        <w:tc>
-          <w:tcPr>
-            <w:tcW w:type="dxa" w:w="2200"/>
-            <w:tcBorders>
-              <w:top w:val="single" w:color="D9D5CB" w:sz="4"/>
-              <w:left w:val="single" w:color="D9D5CB" w:sz="4"/>
-              <w:bottom w:val="single" w:color="D9D5CB" w:sz="4"/>
-              <w:right w:val="single" w:color="D9D5CB" w:sz="4"/>
-            </w:tcBorders>
-            <w:tcMar>
-              <w:top w:type="dxa" w:w="70"/>
-              <w:left w:type="dxa" w:w="100"/>
-              <w:bottom w:type="dxa" w:w="70"/>
-              <w:right w:type="dxa" w:w="100"/>
-            </w:tcMar>
-          </w:tcPr>
-          <w:p>
-            <w:pPr>
-              <w:spacing w:after="0" w:line="252"/>
-            </w:pPr>
-            <w:r>
-              <w:rPr>
-                <w:rFonts w:ascii="Calibri" w:cs="Calibri" w:eastAsia="Calibri" w:hAnsi="Calibri"/>
-                <w:b w:val="false"/>
-                <w:bCs w:val="false"/>
-                <w:color w:val="0C0E13"/>
-                <w:sz w:val="18"/>
-                <w:szCs w:val="18"/>
-              </w:rPr>
-              <w:t xml:space="preserve">Findings</w:t>
-            </w:r>
-          </w:p>
-        </w:tc>
-        <w:tc>
-          <w:tcPr>
-            <w:tcW w:type="dxa" w:w="7160"/>
-            <w:tcBorders>
-              <w:top w:val="single" w:color="D9D5CB" w:sz="4"/>
-              <w:left w:val="single" w:color="D9D5CB" w:sz="4"/>
-              <w:bottom w:val="single" w:color="D9D5CB" w:sz="4"/>
-              <w:right w:val="single" w:color="D9D5CB" w:sz="4"/>
-            </w:tcBorders>
-            <w:tcMar>
-              <w:top w:type="dxa" w:w="70"/>
-              <w:left w:type="dxa" w:w="100"/>
-              <w:bottom w:type="dxa" w:w="70"/>
-              <w:right w:type="dxa" w:w="100"/>
-            </w:tcMar>
-          </w:tcPr>
-          <w:p>
-            <w:pPr>
-              <w:spacing w:after="0" w:line="252"/>
-            </w:pPr>
-            <w:r>
-              <w:rPr>
-                <w:rFonts w:ascii="Calibri" w:cs="Calibri" w:eastAsia="Calibri" w:hAnsi="Calibri"/>
-                <w:b w:val="false"/>
-                <w:bCs w:val="false"/>
-                <w:color w:val="0C0E13"/>
-                <w:sz w:val="18"/>
-                <w:szCs w:val="18"/>
-              </w:rPr>
-              <w:t xml:space="preserve">6 new findings, listed in section 7.</w:t>
+              <w:t xml:space="preserve">Test suite passed 15 of 15 repeated runs and passes on Python 3.11.13 and 3.14.6. Parallel writers lost no entries (100 of 100 test runs recorded).</w:t>
             </w:r>
           </w:p>
         </w:tc>
@@ -1304,7 +1233,7 @@
         <w:pStyle w:val="Heading2"/>
       </w:pPr>
       <w:r>
-        <w:t xml:space="preserve">Misses (2)</w:t>
+        <w:t xml:space="preserve">Misses (1)</w:t>
       </w:r>
     </w:p>
     <w:tbl>
@@ -1548,126 +1477,6 @@
                 <w:szCs w:val="18"/>
               </w:rPr>
               <w:t xml:space="preserve">READY</w:t>
-            </w:r>
-          </w:p>
-        </w:tc>
-      </w:tr>
-      <w:tr>
-        <w:trPr>
-          <w:cantSplit/>
-        </w:trPr>
-        <w:tc>
-          <w:tcPr>
-            <w:tcW w:type="dxa" w:w="5200"/>
-            <w:tcBorders>
-              <w:top w:val="single" w:color="D9D5CB" w:sz="4"/>
-              <w:left w:val="single" w:color="D9D5CB" w:sz="4"/>
-              <w:bottom w:val="single" w:color="D9D5CB" w:sz="4"/>
-              <w:right w:val="single" w:color="D9D5CB" w:sz="4"/>
-            </w:tcBorders>
-            <w:tcMar>
-              <w:top w:type="dxa" w:w="70"/>
-              <w:left w:type="dxa" w:w="100"/>
-              <w:bottom w:type="dxa" w:w="70"/>
-              <w:right w:type="dxa" w:w="100"/>
-            </w:tcMar>
-          </w:tcPr>
-          <w:p>
-            <w:pPr>
-              <w:spacing w:after="0" w:line="252"/>
-            </w:pPr>
-            <w:r>
-              <w:rPr>
-                <w:rFonts w:ascii="Calibri" w:cs="Calibri" w:eastAsia="Calibri" w:hAnsi="Calibri"/>
-                <w:b w:val="false"/>
-                <w:bCs w:val="false"/>
-                <w:color w:val="0C0E13"/>
-                <w:sz w:val="18"/>
-                <w:szCs w:val="18"/>
-              </w:rPr>
-              <w:t xml:space="preserve">state_wrong_type</w:t>
-            </w:r>
-          </w:p>
-          <w:p>
-            <w:pPr>
-              <w:spacing w:after="0" w:line="252"/>
-            </w:pPr>
-            <w:r>
-              <w:rPr>
-                <w:rFonts w:ascii="Calibri" w:cs="Calibri" w:eastAsia="Calibri" w:hAnsi="Calibri"/>
-                <w:b w:val="false"/>
-                <w:bCs w:val="false"/>
-                <w:color w:val="0C0E13"/>
-                <w:sz w:val="18"/>
-                <w:szCs w:val="18"/>
-              </w:rPr>
-              <w:t xml:space="preserve">state.json is a JSON list</w:t>
-            </w:r>
-          </w:p>
-        </w:tc>
-        <w:tc>
-          <w:tcPr>
-            <w:tcW w:type="dxa" w:w="2000"/>
-            <w:tcBorders>
-              <w:top w:val="single" w:color="D9D5CB" w:sz="4"/>
-              <w:left w:val="single" w:color="D9D5CB" w:sz="4"/>
-              <w:bottom w:val="single" w:color="D9D5CB" w:sz="4"/>
-              <w:right w:val="single" w:color="D9D5CB" w:sz="4"/>
-            </w:tcBorders>
-            <w:tcMar>
-              <w:top w:type="dxa" w:w="70"/>
-              <w:left w:type="dxa" w:w="100"/>
-              <w:bottom w:type="dxa" w:w="70"/>
-              <w:right w:type="dxa" w:w="100"/>
-            </w:tcMar>
-          </w:tcPr>
-          <w:p>
-            <w:pPr>
-              <w:spacing w:after="0" w:line="252"/>
-            </w:pPr>
-            <w:r>
-              <w:rPr>
-                <w:rFonts w:ascii="Consolas" w:cs="Consolas" w:eastAsia="Consolas" w:hAnsi="Consolas"/>
-                <w:b w:val="false"/>
-                <w:bCs w:val="false"/>
-                <w:color w:val="0C0E13"/>
-                <w:sz w:val="18"/>
-                <w:szCs w:val="18"/>
-              </w:rPr>
-              <w:t xml:space="preserve">BLOCKED</w:t>
-            </w:r>
-          </w:p>
-        </w:tc>
-        <w:tc>
-          <w:tcPr>
-            <w:tcW w:type="dxa" w:w="2160"/>
-            <w:tcBorders>
-              <w:top w:val="single" w:color="D9D5CB" w:sz="4"/>
-              <w:left w:val="single" w:color="D9D5CB" w:sz="4"/>
-              <w:bottom w:val="single" w:color="D9D5CB" w:sz="4"/>
-              <w:right w:val="single" w:color="D9D5CB" w:sz="4"/>
-            </w:tcBorders>
-            <w:tcMar>
-              <w:top w:type="dxa" w:w="70"/>
-              <w:left w:type="dxa" w:w="100"/>
-              <w:bottom w:type="dxa" w:w="70"/>
-              <w:right w:type="dxa" w:w="100"/>
-            </w:tcMar>
-          </w:tcPr>
-          <w:p>
-            <w:pPr>
-              <w:spacing w:after="0" w:line="252"/>
-            </w:pPr>
-            <w:r>
-              <w:rPr>
-                <w:rFonts w:ascii="Consolas" w:cs="Consolas" w:eastAsia="Consolas" w:hAnsi="Consolas"/>
-                <w:b w:val="false"/>
-                <w:bCs w:val="false"/>
-                <w:color w:val="0C0E13"/>
-                <w:sz w:val="18"/>
-                <w:szCs w:val="18"/>
-              </w:rPr>
-              <w:t xml:space="preserve">crash (traceback)</w:t>
             </w:r>
           </w:p>
         </w:tc>
@@ -2512,7 +2321,7 @@
                 <w:sz w:val="18"/>
                 <w:szCs w:val="18"/>
               </w:rPr>
-              <w:t xml:space="preserve">172</w:t>
+              <w:t xml:space="preserve">114</w:t>
             </w:r>
           </w:p>
         </w:tc>
@@ -2545,7 +2354,7 @@
                 <w:sz w:val="18"/>
                 <w:szCs w:val="18"/>
               </w:rPr>
-              <w:t xml:space="preserve">15,052</w:t>
+              <w:t xml:space="preserve">262</w:t>
             </w:r>
           </w:p>
         </w:tc>
@@ -2578,7 +2387,7 @@
                 <w:sz w:val="18"/>
                 <w:szCs w:val="18"/>
               </w:rPr>
-              <w:t xml:space="preserve">45</w:t>
+              <w:t xml:space="preserve">46</w:t>
             </w:r>
           </w:p>
         </w:tc>
@@ -2649,7 +2458,7 @@
                 <w:sz w:val="18"/>
                 <w:szCs w:val="18"/>
               </w:rPr>
-              <w:t xml:space="preserve">468</w:t>
+              <w:t xml:space="preserve">468.5</w:t>
             </w:r>
           </w:p>
         </w:tc>
@@ -2682,7 +2491,7 @@
                 <w:sz w:val="18"/>
                 <w:szCs w:val="18"/>
               </w:rPr>
-              <w:t xml:space="preserve">539</w:t>
+              <w:t xml:space="preserve">537</w:t>
             </w:r>
           </w:p>
         </w:tc>
@@ -2715,7 +2524,7 @@
                 <w:sz w:val="18"/>
                 <w:szCs w:val="18"/>
               </w:rPr>
-              <w:t xml:space="preserve">15,489</w:t>
+              <w:t xml:space="preserve">584</w:t>
             </w:r>
           </w:p>
         </w:tc>
@@ -2748,7 +2557,7 @@
                 <w:sz w:val="18"/>
                 <w:szCs w:val="18"/>
               </w:rPr>
-              <w:t xml:space="preserve">45</w:t>
+              <w:t xml:space="preserve">46</w:t>
             </w:r>
           </w:p>
         </w:tc>
@@ -2765,7 +2574,7 @@
           <w:sz w:val="20"/>
           <w:szCs w:val="20"/>
         </w:rPr>
-        <w:t xml:space="preserve">The maximum comes from the scenario with 1,000 new files: the gate lists every changed file (finding N3).</w:t>
+        <w:t xml:space="preserve">The maximum comes from the scenario with 1,000 new files. The gate collapses repeated findings into a count, so even that output stays small.</w:t>
       </w:r>
     </w:p>
     <w:p>
@@ -3202,7 +3011,7 @@
                 <w:sz w:val="18"/>
                 <w:szCs w:val="18"/>
               </w:rPr>
-              <w:t xml:space="preserve">385</w:t>
+              <w:t xml:space="preserve">391</w:t>
             </w:r>
           </w:p>
         </w:tc>
@@ -3268,7 +3077,7 @@
                 <w:sz w:val="18"/>
                 <w:szCs w:val="18"/>
               </w:rPr>
-              <w:t xml:space="preserve">4.7x</w:t>
+              <w:t xml:space="preserve">4.6x</w:t>
             </w:r>
           </w:p>
         </w:tc>
@@ -3675,6 +3484,209 @@
                 <w:szCs w:val="18"/>
               </w:rPr>
               <w:t xml:space="preserve">17.4x</w:t>
+            </w:r>
+          </w:p>
+        </w:tc>
+      </w:tr>
+      <w:tr>
+        <w:trPr>
+          <w:cantSplit/>
+        </w:trPr>
+        <w:tc>
+          <w:tcPr>
+            <w:tcW w:type="dxa" w:w="2700"/>
+            <w:tcBorders>
+              <w:top w:val="single" w:color="D9D5CB" w:sz="4"/>
+              <w:left w:val="single" w:color="D9D5CB" w:sz="4"/>
+              <w:bottom w:val="single" w:color="D9D5CB" w:sz="4"/>
+              <w:right w:val="single" w:color="D9D5CB" w:sz="4"/>
+            </w:tcBorders>
+            <w:tcMar>
+              <w:top w:type="dxa" w:w="70"/>
+              <w:left w:type="dxa" w:w="100"/>
+              <w:bottom w:type="dxa" w:w="70"/>
+              <w:right w:type="dxa" w:w="100"/>
+            </w:tcMar>
+          </w:tcPr>
+          <w:p>
+            <w:pPr>
+              <w:spacing w:after="0" w:line="252"/>
+            </w:pPr>
+            <w:r>
+              <w:rPr>
+                <w:rFonts w:ascii="Calibri" w:cs="Calibri" w:eastAsia="Calibri" w:hAnsi="Calibri"/>
+                <w:b w:val="false"/>
+                <w:bCs w:val="false"/>
+                <w:color w:val="0C0E13"/>
+                <w:sz w:val="18"/>
+                <w:szCs w:val="18"/>
+              </w:rPr>
+              <w:t xml:space="preserve">ContextBridge site</w:t>
+            </w:r>
+          </w:p>
+        </w:tc>
+        <w:tc>
+          <w:tcPr>
+            <w:tcW w:type="dxa" w:w="1200"/>
+            <w:tcBorders>
+              <w:top w:val="single" w:color="D9D5CB" w:sz="4"/>
+              <w:left w:val="single" w:color="D9D5CB" w:sz="4"/>
+              <w:bottom w:val="single" w:color="D9D5CB" w:sz="4"/>
+              <w:right w:val="single" w:color="D9D5CB" w:sz="4"/>
+            </w:tcBorders>
+            <w:tcMar>
+              <w:top w:type="dxa" w:w="70"/>
+              <w:left w:type="dxa" w:w="100"/>
+              <w:bottom w:type="dxa" w:w="70"/>
+              <w:right w:type="dxa" w:w="100"/>
+            </w:tcMar>
+          </w:tcPr>
+          <w:p>
+            <w:pPr>
+              <w:spacing w:after="0" w:line="252"/>
+            </w:pPr>
+            <w:r>
+              <w:rPr>
+                <w:rFonts w:ascii="Consolas" w:cs="Consolas" w:eastAsia="Consolas" w:hAnsi="Consolas"/>
+                <w:b w:val="false"/>
+                <w:bCs w:val="false"/>
+                <w:color w:val="0C0E13"/>
+                <w:sz w:val="18"/>
+                <w:szCs w:val="18"/>
+              </w:rPr>
+              <w:t xml:space="preserve">35</w:t>
+            </w:r>
+          </w:p>
+        </w:tc>
+        <w:tc>
+          <w:tcPr>
+            <w:tcW w:type="dxa" w:w="1300"/>
+            <w:tcBorders>
+              <w:top w:val="single" w:color="D9D5CB" w:sz="4"/>
+              <w:left w:val="single" w:color="D9D5CB" w:sz="4"/>
+              <w:bottom w:val="single" w:color="D9D5CB" w:sz="4"/>
+              <w:right w:val="single" w:color="D9D5CB" w:sz="4"/>
+            </w:tcBorders>
+            <w:tcMar>
+              <w:top w:type="dxa" w:w="70"/>
+              <w:left w:type="dxa" w:w="100"/>
+              <w:bottom w:type="dxa" w:w="70"/>
+              <w:right w:type="dxa" w:w="100"/>
+            </w:tcMar>
+          </w:tcPr>
+          <w:p>
+            <w:pPr>
+              <w:spacing w:after="0" w:line="252"/>
+            </w:pPr>
+            <w:r>
+              <w:rPr>
+                <w:rFonts w:ascii="Consolas" w:cs="Consolas" w:eastAsia="Consolas" w:hAnsi="Consolas"/>
+                <w:b w:val="false"/>
+                <w:bCs w:val="false"/>
+                <w:color w:val="0C0E13"/>
+                <w:sz w:val="18"/>
+                <w:szCs w:val="18"/>
+              </w:rPr>
+              <w:t xml:space="preserve">30</w:t>
+            </w:r>
+          </w:p>
+        </w:tc>
+        <w:tc>
+          <w:tcPr>
+            <w:tcW w:type="dxa" w:w="1300"/>
+            <w:tcBorders>
+              <w:top w:val="single" w:color="D9D5CB" w:sz="4"/>
+              <w:left w:val="single" w:color="D9D5CB" w:sz="4"/>
+              <w:bottom w:val="single" w:color="D9D5CB" w:sz="4"/>
+              <w:right w:val="single" w:color="D9D5CB" w:sz="4"/>
+            </w:tcBorders>
+            <w:tcMar>
+              <w:top w:type="dxa" w:w="70"/>
+              <w:left w:type="dxa" w:w="100"/>
+              <w:bottom w:type="dxa" w:w="70"/>
+              <w:right w:type="dxa" w:w="100"/>
+            </w:tcMar>
+          </w:tcPr>
+          <w:p>
+            <w:pPr>
+              <w:spacing w:after="0" w:line="252"/>
+            </w:pPr>
+            <w:r>
+              <w:rPr>
+                <w:rFonts w:ascii="Consolas" w:cs="Consolas" w:eastAsia="Consolas" w:hAnsi="Consolas"/>
+                <w:b w:val="false"/>
+                <w:bCs w:val="false"/>
+                <w:color w:val="0C0E13"/>
+                <w:sz w:val="18"/>
+                <w:szCs w:val="18"/>
+              </w:rPr>
+              <w:t xml:space="preserve">381</w:t>
+            </w:r>
+          </w:p>
+        </w:tc>
+        <w:tc>
+          <w:tcPr>
+            <w:tcW w:type="dxa" w:w="1300"/>
+            <w:tcBorders>
+              <w:top w:val="single" w:color="D9D5CB" w:sz="4"/>
+              <w:left w:val="single" w:color="D9D5CB" w:sz="4"/>
+              <w:bottom w:val="single" w:color="D9D5CB" w:sz="4"/>
+              <w:right w:val="single" w:color="D9D5CB" w:sz="4"/>
+            </w:tcBorders>
+            <w:tcMar>
+              <w:top w:type="dxa" w:w="70"/>
+              <w:left w:type="dxa" w:w="100"/>
+              <w:bottom w:type="dxa" w:w="70"/>
+              <w:right w:type="dxa" w:w="100"/>
+            </w:tcMar>
+          </w:tcPr>
+          <w:p>
+            <w:pPr>
+              <w:spacing w:after="0" w:line="252"/>
+            </w:pPr>
+            <w:r>
+              <w:rPr>
+                <w:rFonts w:ascii="Consolas" w:cs="Consolas" w:eastAsia="Consolas" w:hAnsi="Consolas"/>
+                <w:b w:val="false"/>
+                <w:bCs w:val="false"/>
+                <w:color w:val="0C0E13"/>
+                <w:sz w:val="18"/>
+                <w:szCs w:val="18"/>
+              </w:rPr>
+              <w:t xml:space="preserve">513</w:t>
+            </w:r>
+          </w:p>
+        </w:tc>
+        <w:tc>
+          <w:tcPr>
+            <w:tcW w:type="dxa" w:w="1560"/>
+            <w:tcBorders>
+              <w:top w:val="single" w:color="D9D5CB" w:sz="4"/>
+              <w:left w:val="single" w:color="D9D5CB" w:sz="4"/>
+              <w:bottom w:val="single" w:color="D9D5CB" w:sz="4"/>
+              <w:right w:val="single" w:color="D9D5CB" w:sz="4"/>
+            </w:tcBorders>
+            <w:tcMar>
+              <w:top w:type="dxa" w:w="70"/>
+              <w:left w:type="dxa" w:w="100"/>
+              <w:bottom w:type="dxa" w:w="70"/>
+              <w:right w:type="dxa" w:w="100"/>
+            </w:tcMar>
+          </w:tcPr>
+          <w:p>
+            <w:pPr>
+              <w:spacing w:after="0" w:line="252"/>
+            </w:pPr>
+            <w:r>
+              <w:rPr>
+                <w:rFonts w:ascii="Consolas" w:cs="Consolas" w:eastAsia="Consolas" w:hAnsi="Consolas"/>
+                <w:b w:val="false"/>
+                <w:bCs w:val="false"/>
+                <w:color w:val="0C0E13"/>
+                <w:sz w:val="18"/>
+                <w:szCs w:val="18"/>
+              </w:rPr>
+              <w:t xml:space="preserve">1.3x</w:t>
             </w:r>
           </w:p>
         </w:tc>
@@ -4027,7 +4039,7 @@
                 <w:sz w:val="18"/>
                 <w:szCs w:val="18"/>
               </w:rPr>
-              <w:t xml:space="preserve">531</w:t>
+              <w:t xml:space="preserve">529</w:t>
             </w:r>
           </w:p>
         </w:tc>
@@ -4060,7 +4072,7 @@
                 <w:sz w:val="18"/>
                 <w:szCs w:val="18"/>
               </w:rPr>
-              <w:t xml:space="preserve">826</w:t>
+              <w:t xml:space="preserve">824</w:t>
             </w:r>
           </w:p>
         </w:tc>
@@ -4126,7 +4138,7 @@
                 <w:sz w:val="18"/>
                 <w:szCs w:val="18"/>
               </w:rPr>
-              <w:t xml:space="preserve">1,058</w:t>
+              <w:t xml:space="preserve">1,053</w:t>
             </w:r>
           </w:p>
         </w:tc>
@@ -4197,7 +4209,7 @@
                 <w:sz w:val="18"/>
                 <w:szCs w:val="18"/>
               </w:rPr>
-              <w:t xml:space="preserve">1783</w:t>
+              <w:t xml:space="preserve">1781</w:t>
             </w:r>
           </w:p>
         </w:tc>
@@ -4230,7 +4242,7 @@
                 <w:sz w:val="18"/>
                 <w:szCs w:val="18"/>
               </w:rPr>
-              <w:t xml:space="preserve">2092</w:t>
+              <w:t xml:space="preserve">2090</w:t>
             </w:r>
           </w:p>
         </w:tc>
@@ -4296,7 +4308,7 @@
                 <w:sz w:val="18"/>
                 <w:szCs w:val="18"/>
               </w:rPr>
-              <w:t xml:space="preserve">4,525</w:t>
+              <w:t xml:space="preserve">4,520</w:t>
             </w:r>
           </w:p>
         </w:tc>
@@ -4466,7 +4478,7 @@
                 <w:sz w:val="18"/>
                 <w:szCs w:val="18"/>
               </w:rPr>
-              <w:t xml:space="preserve">8,851</w:t>
+              <w:t xml:space="preserve">8,855</w:t>
             </w:r>
           </w:p>
         </w:tc>
@@ -4636,7 +4648,7 @@
                 <w:sz w:val="18"/>
                 <w:szCs w:val="18"/>
               </w:rPr>
-              <w:t xml:space="preserve">21,851</w:t>
+              <w:t xml:space="preserve">21,853</w:t>
             </w:r>
           </w:p>
         </w:tc>
@@ -4707,7 +4719,7 @@
                 <w:sz w:val="18"/>
                 <w:szCs w:val="18"/>
               </w:rPr>
-              <w:t xml:space="preserve">2623</w:t>
+              <w:t xml:space="preserve">2621</w:t>
             </w:r>
           </w:p>
         </w:tc>
@@ -4740,7 +4752,7 @@
                 <w:sz w:val="18"/>
                 <w:szCs w:val="18"/>
               </w:rPr>
-              <w:t xml:space="preserve">2932</w:t>
+              <w:t xml:space="preserve">2930</w:t>
             </w:r>
           </w:p>
         </w:tc>
@@ -4806,7 +4818,7 @@
                 <w:sz w:val="18"/>
                 <w:szCs w:val="18"/>
               </w:rPr>
-              <w:t xml:space="preserve">43,523</w:t>
+              <w:t xml:space="preserve">43,520</w:t>
             </w:r>
           </w:p>
         </w:tc>
@@ -4976,7 +4988,7 @@
                 <w:sz w:val="18"/>
                 <w:szCs w:val="18"/>
               </w:rPr>
-              <w:t xml:space="preserve">86,857</w:t>
+              <w:t xml:space="preserve">86,851</w:t>
             </w:r>
           </w:p>
         </w:tc>
@@ -5006,7 +5018,7 @@
           <w:sz w:val="22"/>
           <w:szCs w:val="22"/>
         </w:rPr>
-        <w:t xml:space="preserve">Median of 5 runs per cell; each run is a fresh Python process, so every number includes about 62 ms of interpreter startup.</w:t>
+        <w:t xml:space="preserve">Median of 5 runs per cell; each run is a fresh Python process, so every number includes about 40 ms of interpreter startup.</w:t>
       </w:r>
     </w:p>
     <w:p>
@@ -5470,7 +5482,7 @@
                 <w:sz w:val="18"/>
                 <w:szCs w:val="18"/>
               </w:rPr>
-              <w:t xml:space="preserve">121 ms</w:t>
+              <w:t xml:space="preserve">138 ms</w:t>
             </w:r>
           </w:p>
         </w:tc>
@@ -5503,7 +5515,7 @@
                 <w:sz w:val="18"/>
                 <w:szCs w:val="18"/>
               </w:rPr>
-              <w:t xml:space="preserve">88 ms</w:t>
+              <w:t xml:space="preserve">77 ms</w:t>
             </w:r>
           </w:p>
         </w:tc>
@@ -5536,7 +5548,7 @@
                 <w:sz w:val="18"/>
                 <w:szCs w:val="18"/>
               </w:rPr>
-              <w:t xml:space="preserve">88 ms</w:t>
+              <w:t xml:space="preserve">76 ms</w:t>
             </w:r>
           </w:p>
         </w:tc>
@@ -5569,7 +5581,7 @@
                 <w:sz w:val="18"/>
                 <w:szCs w:val="18"/>
               </w:rPr>
-              <w:t xml:space="preserve">92 ms</w:t>
+              <w:t xml:space="preserve">94 ms</w:t>
             </w:r>
           </w:p>
         </w:tc>
@@ -5673,7 +5685,7 @@
                 <w:sz w:val="18"/>
                 <w:szCs w:val="18"/>
               </w:rPr>
-              <w:t xml:space="preserve">14 ms</w:t>
+              <w:t xml:space="preserve">11 ms</w:t>
             </w:r>
           </w:p>
         </w:tc>
@@ -5706,7 +5718,7 @@
                 <w:sz w:val="18"/>
                 <w:szCs w:val="18"/>
               </w:rPr>
-              <w:t xml:space="preserve">125 ms</w:t>
+              <w:t xml:space="preserve">148 ms</w:t>
             </w:r>
           </w:p>
         </w:tc>
@@ -5739,7 +5751,7 @@
                 <w:sz w:val="18"/>
                 <w:szCs w:val="18"/>
               </w:rPr>
-              <w:t xml:space="preserve">89 ms</w:t>
+              <w:t xml:space="preserve">79 ms</w:t>
             </w:r>
           </w:p>
         </w:tc>
@@ -5772,7 +5784,7 @@
                 <w:sz w:val="18"/>
                 <w:szCs w:val="18"/>
               </w:rPr>
-              <w:t xml:space="preserve">91 ms</w:t>
+              <w:t xml:space="preserve">79 ms</w:t>
             </w:r>
           </w:p>
         </w:tc>
@@ -5805,7 +5817,7 @@
                 <w:sz w:val="18"/>
                 <w:szCs w:val="18"/>
               </w:rPr>
-              <w:t xml:space="preserve">98 ms</w:t>
+              <w:t xml:space="preserve">103 ms</w:t>
             </w:r>
           </w:p>
         </w:tc>
@@ -5909,7 +5921,7 @@
                 <w:sz w:val="18"/>
                 <w:szCs w:val="18"/>
               </w:rPr>
-              <w:t xml:space="preserve">14 ms</w:t>
+              <w:t xml:space="preserve">13 ms</w:t>
             </w:r>
           </w:p>
         </w:tc>
@@ -5942,7 +5954,7 @@
                 <w:sz w:val="18"/>
                 <w:szCs w:val="18"/>
               </w:rPr>
-              <w:t xml:space="preserve">151 ms</w:t>
+              <w:t xml:space="preserve">143 ms</w:t>
             </w:r>
           </w:p>
         </w:tc>
@@ -5975,7 +5987,7 @@
                 <w:sz w:val="18"/>
                 <w:szCs w:val="18"/>
               </w:rPr>
-              <w:t xml:space="preserve">102 ms</w:t>
+              <w:t xml:space="preserve">78 ms</w:t>
             </w:r>
           </w:p>
         </w:tc>
@@ -6008,7 +6020,7 @@
                 <w:sz w:val="18"/>
                 <w:szCs w:val="18"/>
               </w:rPr>
-              <w:t xml:space="preserve">109 ms</w:t>
+              <w:t xml:space="preserve">78 ms</w:t>
             </w:r>
           </w:p>
         </w:tc>
@@ -6041,7 +6053,7 @@
                 <w:sz w:val="18"/>
                 <w:szCs w:val="18"/>
               </w:rPr>
-              <w:t xml:space="preserve">109 ms</w:t>
+              <w:t xml:space="preserve">98 ms</w:t>
             </w:r>
           </w:p>
         </w:tc>
@@ -6145,7 +6157,7 @@
                 <w:sz w:val="18"/>
                 <w:szCs w:val="18"/>
               </w:rPr>
-              <w:t xml:space="preserve">19 ms</w:t>
+              <w:t xml:space="preserve">13 ms</w:t>
             </w:r>
           </w:p>
         </w:tc>
@@ -6178,7 +6190,7 @@
                 <w:sz w:val="18"/>
                 <w:szCs w:val="18"/>
               </w:rPr>
-              <w:t xml:space="preserve">191 ms</w:t>
+              <w:t xml:space="preserve">152 ms</w:t>
             </w:r>
           </w:p>
         </w:tc>
@@ -6211,7 +6223,7 @@
                 <w:sz w:val="18"/>
                 <w:szCs w:val="18"/>
               </w:rPr>
-              <w:t xml:space="preserve">127 ms</w:t>
+              <w:t xml:space="preserve">83 ms</w:t>
             </w:r>
           </w:p>
         </w:tc>
@@ -6244,7 +6256,7 @@
                 <w:sz w:val="18"/>
                 <w:szCs w:val="18"/>
               </w:rPr>
-              <w:t xml:space="preserve">144 ms</w:t>
+              <w:t xml:space="preserve">80 ms</w:t>
             </w:r>
           </w:p>
         </w:tc>
@@ -6277,7 +6289,7 @@
                 <w:sz w:val="18"/>
                 <w:szCs w:val="18"/>
               </w:rPr>
-              <w:t xml:space="preserve">153 ms</w:t>
+              <w:t xml:space="preserve">103 ms</w:t>
             </w:r>
           </w:p>
         </w:tc>
@@ -6381,7 +6393,7 @@
                 <w:sz w:val="18"/>
                 <w:szCs w:val="18"/>
               </w:rPr>
-              <w:t xml:space="preserve">19 ms</w:t>
+              <w:t xml:space="preserve">14 ms</w:t>
             </w:r>
           </w:p>
         </w:tc>
@@ -6414,7 +6426,7 @@
                 <w:sz w:val="18"/>
                 <w:szCs w:val="18"/>
               </w:rPr>
-              <w:t xml:space="preserve">204 ms</w:t>
+              <w:t xml:space="preserve">187 ms</w:t>
             </w:r>
           </w:p>
         </w:tc>
@@ -6447,7 +6459,7 @@
                 <w:sz w:val="18"/>
                 <w:szCs w:val="18"/>
               </w:rPr>
-              <w:t xml:space="preserve">131 ms</w:t>
+              <w:t xml:space="preserve">91 ms</w:t>
             </w:r>
           </w:p>
         </w:tc>
@@ -6480,7 +6492,7 @@
                 <w:sz w:val="18"/>
                 <w:szCs w:val="18"/>
               </w:rPr>
-              <w:t xml:space="preserve">131 ms</w:t>
+              <w:t xml:space="preserve">92 ms</w:t>
             </w:r>
           </w:p>
         </w:tc>
@@ -6513,7 +6525,7 @@
                 <w:sz w:val="18"/>
                 <w:szCs w:val="18"/>
               </w:rPr>
-              <w:t xml:space="preserve">158 ms</w:t>
+              <w:t xml:space="preserve">144 ms</w:t>
             </w:r>
           </w:p>
         </w:tc>
@@ -6617,7 +6629,7 @@
                 <w:sz w:val="18"/>
                 <w:szCs w:val="18"/>
               </w:rPr>
-              <w:t xml:space="preserve">26 ms</w:t>
+              <w:t xml:space="preserve">22 ms</w:t>
             </w:r>
           </w:p>
         </w:tc>
@@ -6650,7 +6662,7 @@
                 <w:sz w:val="18"/>
                 <w:szCs w:val="18"/>
               </w:rPr>
-              <w:t xml:space="preserve">163 ms</w:t>
+              <w:t xml:space="preserve">176 ms</w:t>
             </w:r>
           </w:p>
         </w:tc>
@@ -6683,7 +6695,7 @@
                 <w:sz w:val="18"/>
                 <w:szCs w:val="18"/>
               </w:rPr>
-              <w:t xml:space="preserve">114 ms</w:t>
+              <w:t xml:space="preserve">95 ms</w:t>
             </w:r>
           </w:p>
         </w:tc>
@@ -6716,7 +6728,7 @@
                 <w:sz w:val="18"/>
                 <w:szCs w:val="18"/>
               </w:rPr>
-              <w:t xml:space="preserve">115 ms</w:t>
+              <w:t xml:space="preserve">90 ms</w:t>
             </w:r>
           </w:p>
         </w:tc>
@@ -6749,7 +6761,7 @@
                 <w:sz w:val="18"/>
                 <w:szCs w:val="18"/>
               </w:rPr>
-              <w:t xml:space="preserve">124 ms</w:t>
+              <w:t xml:space="preserve">113 ms</w:t>
             </w:r>
           </w:p>
         </w:tc>
@@ -6853,7 +6865,7 @@
                 <w:sz w:val="18"/>
                 <w:szCs w:val="18"/>
               </w:rPr>
-              <w:t xml:space="preserve">26 ms</w:t>
+              <w:t xml:space="preserve">22 ms</w:t>
             </w:r>
           </w:p>
         </w:tc>
@@ -6886,7 +6898,7 @@
                 <w:sz w:val="18"/>
                 <w:szCs w:val="18"/>
               </w:rPr>
-              <w:t xml:space="preserve">180 ms</w:t>
+              <w:t xml:space="preserve">179 ms</w:t>
             </w:r>
           </w:p>
         </w:tc>
@@ -6919,7 +6931,7 @@
                 <w:sz w:val="18"/>
                 <w:szCs w:val="18"/>
               </w:rPr>
-              <w:t xml:space="preserve">124 ms</w:t>
+              <w:t xml:space="preserve">91 ms</w:t>
             </w:r>
           </w:p>
         </w:tc>
@@ -6952,40 +6964,40 @@
                 <w:sz w:val="18"/>
                 <w:szCs w:val="18"/>
               </w:rPr>
+              <w:t xml:space="preserve">95 ms</w:t>
+            </w:r>
+          </w:p>
+        </w:tc>
+        <w:tc>
+          <w:tcPr>
+            <w:tcW w:type="dxa" w:w="1360"/>
+            <w:tcBorders>
+              <w:top w:val="single" w:color="D9D5CB" w:sz="4"/>
+              <w:left w:val="single" w:color="D9D5CB" w:sz="4"/>
+              <w:bottom w:val="single" w:color="D9D5CB" w:sz="4"/>
+              <w:right w:val="single" w:color="D9D5CB" w:sz="4"/>
+            </w:tcBorders>
+            <w:tcMar>
+              <w:top w:type="dxa" w:w="70"/>
+              <w:left w:type="dxa" w:w="100"/>
+              <w:bottom w:type="dxa" w:w="70"/>
+              <w:right w:type="dxa" w:w="100"/>
+            </w:tcMar>
+          </w:tcPr>
+          <w:p>
+            <w:pPr>
+              <w:spacing w:after="0" w:line="252"/>
+            </w:pPr>
+            <w:r>
+              <w:rPr>
+                <w:rFonts w:ascii="Consolas" w:cs="Consolas" w:eastAsia="Consolas" w:hAnsi="Consolas"/>
+                <w:b w:val="false"/>
+                <w:bCs w:val="false"/>
+                <w:color w:val="0C0E13"/>
+                <w:sz w:val="18"/>
+                <w:szCs w:val="18"/>
+              </w:rPr>
               <w:t xml:space="preserve">120 ms</w:t>
-            </w:r>
-          </w:p>
-        </w:tc>
-        <w:tc>
-          <w:tcPr>
-            <w:tcW w:type="dxa" w:w="1360"/>
-            <w:tcBorders>
-              <w:top w:val="single" w:color="D9D5CB" w:sz="4"/>
-              <w:left w:val="single" w:color="D9D5CB" w:sz="4"/>
-              <w:bottom w:val="single" w:color="D9D5CB" w:sz="4"/>
-              <w:right w:val="single" w:color="D9D5CB" w:sz="4"/>
-            </w:tcBorders>
-            <w:tcMar>
-              <w:top w:type="dxa" w:w="70"/>
-              <w:left w:type="dxa" w:w="100"/>
-              <w:bottom w:type="dxa" w:w="70"/>
-              <w:right w:type="dxa" w:w="100"/>
-            </w:tcMar>
-          </w:tcPr>
-          <w:p>
-            <w:pPr>
-              <w:spacing w:after="0" w:line="252"/>
-            </w:pPr>
-            <w:r>
-              <w:rPr>
-                <w:rFonts w:ascii="Consolas" w:cs="Consolas" w:eastAsia="Consolas" w:hAnsi="Consolas"/>
-                <w:b w:val="false"/>
-                <w:bCs w:val="false"/>
-                <w:color w:val="0C0E13"/>
-                <w:sz w:val="18"/>
-                <w:szCs w:val="18"/>
-              </w:rPr>
-              <w:t xml:space="preserve">128 ms</w:t>
             </w:r>
           </w:p>
         </w:tc>
@@ -7089,7 +7101,7 @@
                 <w:sz w:val="18"/>
                 <w:szCs w:val="18"/>
               </w:rPr>
-              <w:t xml:space="preserve">27 ms</w:t>
+              <w:t xml:space="preserve">23 ms</w:t>
             </w:r>
           </w:p>
         </w:tc>
@@ -7122,7 +7134,7 @@
                 <w:sz w:val="18"/>
                 <w:szCs w:val="18"/>
               </w:rPr>
-              <w:t xml:space="preserve">215 ms</w:t>
+              <w:t xml:space="preserve">265 ms</w:t>
             </w:r>
           </w:p>
         </w:tc>
@@ -7155,7 +7167,7 @@
                 <w:sz w:val="18"/>
                 <w:szCs w:val="18"/>
               </w:rPr>
-              <w:t xml:space="preserve">132 ms</w:t>
+              <w:t xml:space="preserve">143 ms</w:t>
             </w:r>
           </w:p>
         </w:tc>
@@ -7188,7 +7200,7 @@
                 <w:sz w:val="18"/>
                 <w:szCs w:val="18"/>
               </w:rPr>
-              <w:t xml:space="preserve">142 ms</w:t>
+              <w:t xml:space="preserve">128 ms</w:t>
             </w:r>
           </w:p>
         </w:tc>
@@ -7221,7 +7233,7 @@
                 <w:sz w:val="18"/>
                 <w:szCs w:val="18"/>
               </w:rPr>
-              <w:t xml:space="preserve">158 ms</w:t>
+              <w:t xml:space="preserve">192 ms</w:t>
             </w:r>
           </w:p>
         </w:tc>
@@ -7388,7 +7400,7 @@
                 <w:sz w:val="18"/>
                 <w:szCs w:val="18"/>
               </w:rPr>
-              <w:t xml:space="preserve">67 ms / 68 ms with 500 work items (88,474 bytes)</w:t>
+              <w:t xml:space="preserve">84 ms / 98 ms with 500 work items (88,474 bytes)</w:t>
             </w:r>
           </w:p>
         </w:tc>
@@ -7459,7 +7471,7 @@
                 <w:sz w:val="18"/>
                 <w:szCs w:val="18"/>
               </w:rPr>
-              <w:t xml:space="preserve">about 6.9 MB/s</w:t>
+              <w:t xml:space="preserve">about 3.9 MB/s</w:t>
             </w:r>
           </w:p>
         </w:tc>
@@ -7530,7 +7542,7 @@
                 <w:sz w:val="18"/>
                 <w:szCs w:val="18"/>
               </w:rPr>
-              <w:t xml:space="preserve">36 ms</w:t>
+              <w:t xml:space="preserve">37 ms</w:t>
             </w:r>
           </w:p>
         </w:tc>
@@ -7568,7 +7580,7 @@
         <w:pStyle w:val="Heading2"/>
       </w:pPr>
       <w:r>
-        <w:t xml:space="preserve">Formats with dedicated patterns (24)</w:t>
+        <w:t xml:space="preserve">Formats with dedicated patterns (31)</w:t>
       </w:r>
     </w:p>
     <w:tbl>
@@ -9601,7 +9613,7 @@
                 <w:sz w:val="18"/>
                 <w:szCs w:val="18"/>
               </w:rPr>
-              <w:t xml:space="preserve">azure account key</w:t>
+              <w:t xml:space="preserve">gitlab pat</w:t>
             </w:r>
           </w:p>
         </w:tc>
@@ -9705,7 +9717,7 @@
                 <w:sz w:val="18"/>
                 <w:szCs w:val="18"/>
               </w:rPr>
-              <w:t xml:space="preserve">db url password</w:t>
+              <w:t xml:space="preserve">huggingface</w:t>
             </w:r>
           </w:p>
         </w:tc>
@@ -9809,7 +9821,7 @@
                 <w:sz w:val="18"/>
                 <w:szCs w:val="18"/>
               </w:rPr>
-              <w:t xml:space="preserve">mongodb srv</w:t>
+              <w:t xml:space="preserve">pypi token</w:t>
             </w:r>
           </w:p>
         </w:tc>
@@ -9913,7 +9925,7 @@
                 <w:sz w:val="18"/>
                 <w:szCs w:val="18"/>
               </w:rPr>
-              <w:t xml:space="preserve">password assign</w:t>
+              <w:t xml:space="preserve">digitalocean</w:t>
             </w:r>
           </w:p>
         </w:tc>
@@ -10017,7 +10029,7 @@
                 <w:sz w:val="18"/>
                 <w:szCs w:val="18"/>
               </w:rPr>
-              <w:t xml:space="preserve">api key json</w:t>
+              <w:t xml:space="preserve">shopify</w:t>
             </w:r>
           </w:p>
         </w:tc>
@@ -10121,6 +10133,734 @@
                 <w:sz w:val="18"/>
                 <w:szCs w:val="18"/>
               </w:rPr>
+              <w:t xml:space="preserve">mailchimp</w:t>
+            </w:r>
+          </w:p>
+        </w:tc>
+        <w:tc>
+          <w:tcPr>
+            <w:tcW w:type="dxa" w:w="2200"/>
+            <w:tcBorders>
+              <w:top w:val="single" w:color="D9D5CB" w:sz="4"/>
+              <w:left w:val="single" w:color="D9D5CB" w:sz="4"/>
+              <w:bottom w:val="single" w:color="D9D5CB" w:sz="4"/>
+              <w:right w:val="single" w:color="D9D5CB" w:sz="4"/>
+            </w:tcBorders>
+            <w:tcMar>
+              <w:top w:type="dxa" w:w="70"/>
+              <w:left w:type="dxa" w:w="100"/>
+              <w:bottom w:type="dxa" w:w="70"/>
+              <w:right w:type="dxa" w:w="100"/>
+            </w:tcMar>
+          </w:tcPr>
+          <w:p>
+            <w:pPr>
+              <w:spacing w:after="0" w:line="252"/>
+            </w:pPr>
+            <w:r>
+              <w:rPr>
+                <w:rFonts w:ascii="Consolas" w:cs="Consolas" w:eastAsia="Consolas" w:hAnsi="Consolas"/>
+                <w:b w:val="false"/>
+                <w:bCs w:val="false"/>
+                <w:color w:val="0C0E13"/>
+                <w:sz w:val="18"/>
+                <w:szCs w:val="18"/>
+              </w:rPr>
+              <w:t xml:space="preserve">100%</w:t>
+            </w:r>
+          </w:p>
+        </w:tc>
+        <w:tc>
+          <w:tcPr>
+            <w:tcW w:type="dxa" w:w="2760"/>
+            <w:tcBorders>
+              <w:top w:val="single" w:color="D9D5CB" w:sz="4"/>
+              <w:left w:val="single" w:color="D9D5CB" w:sz="4"/>
+              <w:bottom w:val="single" w:color="D9D5CB" w:sz="4"/>
+              <w:right w:val="single" w:color="D9D5CB" w:sz="4"/>
+            </w:tcBorders>
+            <w:tcMar>
+              <w:top w:type="dxa" w:w="70"/>
+              <w:left w:type="dxa" w:w="100"/>
+              <w:bottom w:type="dxa" w:w="70"/>
+              <w:right w:type="dxa" w:w="100"/>
+            </w:tcMar>
+          </w:tcPr>
+          <w:p>
+            <w:pPr>
+              <w:spacing w:after="0" w:line="252"/>
+            </w:pPr>
+            <w:r>
+              <w:rPr>
+                <w:rFonts w:ascii="Consolas" w:cs="Consolas" w:eastAsia="Consolas" w:hAnsi="Consolas"/>
+                <w:b w:val="false"/>
+                <w:bCs w:val="false"/>
+                <w:color w:val="0C0E13"/>
+                <w:sz w:val="18"/>
+                <w:szCs w:val="18"/>
+              </w:rPr>
+              <w:t xml:space="preserve">100%</w:t>
+            </w:r>
+          </w:p>
+        </w:tc>
+      </w:tr>
+      <w:tr>
+        <w:trPr>
+          <w:cantSplit/>
+        </w:trPr>
+        <w:tc>
+          <w:tcPr>
+            <w:tcW w:type="dxa" w:w="4400"/>
+            <w:tcBorders>
+              <w:top w:val="single" w:color="D9D5CB" w:sz="4"/>
+              <w:left w:val="single" w:color="D9D5CB" w:sz="4"/>
+              <w:bottom w:val="single" w:color="D9D5CB" w:sz="4"/>
+              <w:right w:val="single" w:color="D9D5CB" w:sz="4"/>
+            </w:tcBorders>
+            <w:tcMar>
+              <w:top w:type="dxa" w:w="70"/>
+              <w:left w:type="dxa" w:w="100"/>
+              <w:bottom w:type="dxa" w:w="70"/>
+              <w:right w:type="dxa" w:w="100"/>
+            </w:tcMar>
+          </w:tcPr>
+          <w:p>
+            <w:pPr>
+              <w:spacing w:after="0" w:line="252"/>
+            </w:pPr>
+            <w:r>
+              <w:rPr>
+                <w:rFonts w:ascii="Calibri" w:cs="Calibri" w:eastAsia="Calibri" w:hAnsi="Calibri"/>
+                <w:b w:val="false"/>
+                <w:bCs w:val="false"/>
+                <w:color w:val="0C0E13"/>
+                <w:sz w:val="18"/>
+                <w:szCs w:val="18"/>
+              </w:rPr>
+              <w:t xml:space="preserve">telegram bot</w:t>
+            </w:r>
+          </w:p>
+        </w:tc>
+        <w:tc>
+          <w:tcPr>
+            <w:tcW w:type="dxa" w:w="2200"/>
+            <w:tcBorders>
+              <w:top w:val="single" w:color="D9D5CB" w:sz="4"/>
+              <w:left w:val="single" w:color="D9D5CB" w:sz="4"/>
+              <w:bottom w:val="single" w:color="D9D5CB" w:sz="4"/>
+              <w:right w:val="single" w:color="D9D5CB" w:sz="4"/>
+            </w:tcBorders>
+            <w:tcMar>
+              <w:top w:type="dxa" w:w="70"/>
+              <w:left w:type="dxa" w:w="100"/>
+              <w:bottom w:type="dxa" w:w="70"/>
+              <w:right w:type="dxa" w:w="100"/>
+            </w:tcMar>
+          </w:tcPr>
+          <w:p>
+            <w:pPr>
+              <w:spacing w:after="0" w:line="252"/>
+            </w:pPr>
+            <w:r>
+              <w:rPr>
+                <w:rFonts w:ascii="Consolas" w:cs="Consolas" w:eastAsia="Consolas" w:hAnsi="Consolas"/>
+                <w:b w:val="false"/>
+                <w:bCs w:val="false"/>
+                <w:color w:val="0C0E13"/>
+                <w:sz w:val="18"/>
+                <w:szCs w:val="18"/>
+              </w:rPr>
+              <w:t xml:space="preserve">100%</w:t>
+            </w:r>
+          </w:p>
+        </w:tc>
+        <w:tc>
+          <w:tcPr>
+            <w:tcW w:type="dxa" w:w="2760"/>
+            <w:tcBorders>
+              <w:top w:val="single" w:color="D9D5CB" w:sz="4"/>
+              <w:left w:val="single" w:color="D9D5CB" w:sz="4"/>
+              <w:bottom w:val="single" w:color="D9D5CB" w:sz="4"/>
+              <w:right w:val="single" w:color="D9D5CB" w:sz="4"/>
+            </w:tcBorders>
+            <w:tcMar>
+              <w:top w:type="dxa" w:w="70"/>
+              <w:left w:type="dxa" w:w="100"/>
+              <w:bottom w:type="dxa" w:w="70"/>
+              <w:right w:type="dxa" w:w="100"/>
+            </w:tcMar>
+          </w:tcPr>
+          <w:p>
+            <w:pPr>
+              <w:spacing w:after="0" w:line="252"/>
+            </w:pPr>
+            <w:r>
+              <w:rPr>
+                <w:rFonts w:ascii="Consolas" w:cs="Consolas" w:eastAsia="Consolas" w:hAnsi="Consolas"/>
+                <w:b w:val="false"/>
+                <w:bCs w:val="false"/>
+                <w:color w:val="0C0E13"/>
+                <w:sz w:val="18"/>
+                <w:szCs w:val="18"/>
+              </w:rPr>
+              <w:t xml:space="preserve">100%</w:t>
+            </w:r>
+          </w:p>
+        </w:tc>
+      </w:tr>
+      <w:tr>
+        <w:trPr>
+          <w:cantSplit/>
+        </w:trPr>
+        <w:tc>
+          <w:tcPr>
+            <w:tcW w:type="dxa" w:w="4400"/>
+            <w:tcBorders>
+              <w:top w:val="single" w:color="D9D5CB" w:sz="4"/>
+              <w:left w:val="single" w:color="D9D5CB" w:sz="4"/>
+              <w:bottom w:val="single" w:color="D9D5CB" w:sz="4"/>
+              <w:right w:val="single" w:color="D9D5CB" w:sz="4"/>
+            </w:tcBorders>
+            <w:tcMar>
+              <w:top w:type="dxa" w:w="70"/>
+              <w:left w:type="dxa" w:w="100"/>
+              <w:bottom w:type="dxa" w:w="70"/>
+              <w:right w:type="dxa" w:w="100"/>
+            </w:tcMar>
+          </w:tcPr>
+          <w:p>
+            <w:pPr>
+              <w:spacing w:after="0" w:line="252"/>
+            </w:pPr>
+            <w:r>
+              <w:rPr>
+                <w:rFonts w:ascii="Calibri" w:cs="Calibri" w:eastAsia="Calibri" w:hAnsi="Calibri"/>
+                <w:b w:val="false"/>
+                <w:bCs w:val="false"/>
+                <w:color w:val="0C0E13"/>
+                <w:sz w:val="18"/>
+                <w:szCs w:val="18"/>
+              </w:rPr>
+              <w:t xml:space="preserve">azure account key</w:t>
+            </w:r>
+          </w:p>
+        </w:tc>
+        <w:tc>
+          <w:tcPr>
+            <w:tcW w:type="dxa" w:w="2200"/>
+            <w:tcBorders>
+              <w:top w:val="single" w:color="D9D5CB" w:sz="4"/>
+              <w:left w:val="single" w:color="D9D5CB" w:sz="4"/>
+              <w:bottom w:val="single" w:color="D9D5CB" w:sz="4"/>
+              <w:right w:val="single" w:color="D9D5CB" w:sz="4"/>
+            </w:tcBorders>
+            <w:tcMar>
+              <w:top w:type="dxa" w:w="70"/>
+              <w:left w:type="dxa" w:w="100"/>
+              <w:bottom w:type="dxa" w:w="70"/>
+              <w:right w:type="dxa" w:w="100"/>
+            </w:tcMar>
+          </w:tcPr>
+          <w:p>
+            <w:pPr>
+              <w:spacing w:after="0" w:line="252"/>
+            </w:pPr>
+            <w:r>
+              <w:rPr>
+                <w:rFonts w:ascii="Consolas" w:cs="Consolas" w:eastAsia="Consolas" w:hAnsi="Consolas"/>
+                <w:b w:val="false"/>
+                <w:bCs w:val="false"/>
+                <w:color w:val="0C0E13"/>
+                <w:sz w:val="18"/>
+                <w:szCs w:val="18"/>
+              </w:rPr>
+              <w:t xml:space="preserve">100%</w:t>
+            </w:r>
+          </w:p>
+        </w:tc>
+        <w:tc>
+          <w:tcPr>
+            <w:tcW w:type="dxa" w:w="2760"/>
+            <w:tcBorders>
+              <w:top w:val="single" w:color="D9D5CB" w:sz="4"/>
+              <w:left w:val="single" w:color="D9D5CB" w:sz="4"/>
+              <w:bottom w:val="single" w:color="D9D5CB" w:sz="4"/>
+              <w:right w:val="single" w:color="D9D5CB" w:sz="4"/>
+            </w:tcBorders>
+            <w:tcMar>
+              <w:top w:type="dxa" w:w="70"/>
+              <w:left w:type="dxa" w:w="100"/>
+              <w:bottom w:type="dxa" w:w="70"/>
+              <w:right w:type="dxa" w:w="100"/>
+            </w:tcMar>
+          </w:tcPr>
+          <w:p>
+            <w:pPr>
+              <w:spacing w:after="0" w:line="252"/>
+            </w:pPr>
+            <w:r>
+              <w:rPr>
+                <w:rFonts w:ascii="Consolas" w:cs="Consolas" w:eastAsia="Consolas" w:hAnsi="Consolas"/>
+                <w:b w:val="false"/>
+                <w:bCs w:val="false"/>
+                <w:color w:val="0C0E13"/>
+                <w:sz w:val="18"/>
+                <w:szCs w:val="18"/>
+              </w:rPr>
+              <w:t xml:space="preserve">100%</w:t>
+            </w:r>
+          </w:p>
+        </w:tc>
+      </w:tr>
+      <w:tr>
+        <w:trPr>
+          <w:cantSplit/>
+        </w:trPr>
+        <w:tc>
+          <w:tcPr>
+            <w:tcW w:type="dxa" w:w="4400"/>
+            <w:tcBorders>
+              <w:top w:val="single" w:color="D9D5CB" w:sz="4"/>
+              <w:left w:val="single" w:color="D9D5CB" w:sz="4"/>
+              <w:bottom w:val="single" w:color="D9D5CB" w:sz="4"/>
+              <w:right w:val="single" w:color="D9D5CB" w:sz="4"/>
+            </w:tcBorders>
+            <w:tcMar>
+              <w:top w:type="dxa" w:w="70"/>
+              <w:left w:type="dxa" w:w="100"/>
+              <w:bottom w:type="dxa" w:w="70"/>
+              <w:right w:type="dxa" w:w="100"/>
+            </w:tcMar>
+          </w:tcPr>
+          <w:p>
+            <w:pPr>
+              <w:spacing w:after="0" w:line="252"/>
+            </w:pPr>
+            <w:r>
+              <w:rPr>
+                <w:rFonts w:ascii="Calibri" w:cs="Calibri" w:eastAsia="Calibri" w:hAnsi="Calibri"/>
+                <w:b w:val="false"/>
+                <w:bCs w:val="false"/>
+                <w:color w:val="0C0E13"/>
+                <w:sz w:val="18"/>
+                <w:szCs w:val="18"/>
+              </w:rPr>
+              <w:t xml:space="preserve">db url password</w:t>
+            </w:r>
+          </w:p>
+        </w:tc>
+        <w:tc>
+          <w:tcPr>
+            <w:tcW w:type="dxa" w:w="2200"/>
+            <w:tcBorders>
+              <w:top w:val="single" w:color="D9D5CB" w:sz="4"/>
+              <w:left w:val="single" w:color="D9D5CB" w:sz="4"/>
+              <w:bottom w:val="single" w:color="D9D5CB" w:sz="4"/>
+              <w:right w:val="single" w:color="D9D5CB" w:sz="4"/>
+            </w:tcBorders>
+            <w:tcMar>
+              <w:top w:type="dxa" w:w="70"/>
+              <w:left w:type="dxa" w:w="100"/>
+              <w:bottom w:type="dxa" w:w="70"/>
+              <w:right w:type="dxa" w:w="100"/>
+            </w:tcMar>
+          </w:tcPr>
+          <w:p>
+            <w:pPr>
+              <w:spacing w:after="0" w:line="252"/>
+            </w:pPr>
+            <w:r>
+              <w:rPr>
+                <w:rFonts w:ascii="Consolas" w:cs="Consolas" w:eastAsia="Consolas" w:hAnsi="Consolas"/>
+                <w:b w:val="false"/>
+                <w:bCs w:val="false"/>
+                <w:color w:val="0C0E13"/>
+                <w:sz w:val="18"/>
+                <w:szCs w:val="18"/>
+              </w:rPr>
+              <w:t xml:space="preserve">100%</w:t>
+            </w:r>
+          </w:p>
+        </w:tc>
+        <w:tc>
+          <w:tcPr>
+            <w:tcW w:type="dxa" w:w="2760"/>
+            <w:tcBorders>
+              <w:top w:val="single" w:color="D9D5CB" w:sz="4"/>
+              <w:left w:val="single" w:color="D9D5CB" w:sz="4"/>
+              <w:bottom w:val="single" w:color="D9D5CB" w:sz="4"/>
+              <w:right w:val="single" w:color="D9D5CB" w:sz="4"/>
+            </w:tcBorders>
+            <w:tcMar>
+              <w:top w:type="dxa" w:w="70"/>
+              <w:left w:type="dxa" w:w="100"/>
+              <w:bottom w:type="dxa" w:w="70"/>
+              <w:right w:type="dxa" w:w="100"/>
+            </w:tcMar>
+          </w:tcPr>
+          <w:p>
+            <w:pPr>
+              <w:spacing w:after="0" w:line="252"/>
+            </w:pPr>
+            <w:r>
+              <w:rPr>
+                <w:rFonts w:ascii="Consolas" w:cs="Consolas" w:eastAsia="Consolas" w:hAnsi="Consolas"/>
+                <w:b w:val="false"/>
+                <w:bCs w:val="false"/>
+                <w:color w:val="0C0E13"/>
+                <w:sz w:val="18"/>
+                <w:szCs w:val="18"/>
+              </w:rPr>
+              <w:t xml:space="preserve">100%</w:t>
+            </w:r>
+          </w:p>
+        </w:tc>
+      </w:tr>
+      <w:tr>
+        <w:trPr>
+          <w:cantSplit/>
+        </w:trPr>
+        <w:tc>
+          <w:tcPr>
+            <w:tcW w:type="dxa" w:w="4400"/>
+            <w:tcBorders>
+              <w:top w:val="single" w:color="D9D5CB" w:sz="4"/>
+              <w:left w:val="single" w:color="D9D5CB" w:sz="4"/>
+              <w:bottom w:val="single" w:color="D9D5CB" w:sz="4"/>
+              <w:right w:val="single" w:color="D9D5CB" w:sz="4"/>
+            </w:tcBorders>
+            <w:tcMar>
+              <w:top w:type="dxa" w:w="70"/>
+              <w:left w:type="dxa" w:w="100"/>
+              <w:bottom w:type="dxa" w:w="70"/>
+              <w:right w:type="dxa" w:w="100"/>
+            </w:tcMar>
+          </w:tcPr>
+          <w:p>
+            <w:pPr>
+              <w:spacing w:after="0" w:line="252"/>
+            </w:pPr>
+            <w:r>
+              <w:rPr>
+                <w:rFonts w:ascii="Calibri" w:cs="Calibri" w:eastAsia="Calibri" w:hAnsi="Calibri"/>
+                <w:b w:val="false"/>
+                <w:bCs w:val="false"/>
+                <w:color w:val="0C0E13"/>
+                <w:sz w:val="18"/>
+                <w:szCs w:val="18"/>
+              </w:rPr>
+              <w:t xml:space="preserve">mongodb srv</w:t>
+            </w:r>
+          </w:p>
+        </w:tc>
+        <w:tc>
+          <w:tcPr>
+            <w:tcW w:type="dxa" w:w="2200"/>
+            <w:tcBorders>
+              <w:top w:val="single" w:color="D9D5CB" w:sz="4"/>
+              <w:left w:val="single" w:color="D9D5CB" w:sz="4"/>
+              <w:bottom w:val="single" w:color="D9D5CB" w:sz="4"/>
+              <w:right w:val="single" w:color="D9D5CB" w:sz="4"/>
+            </w:tcBorders>
+            <w:tcMar>
+              <w:top w:type="dxa" w:w="70"/>
+              <w:left w:type="dxa" w:w="100"/>
+              <w:bottom w:type="dxa" w:w="70"/>
+              <w:right w:type="dxa" w:w="100"/>
+            </w:tcMar>
+          </w:tcPr>
+          <w:p>
+            <w:pPr>
+              <w:spacing w:after="0" w:line="252"/>
+            </w:pPr>
+            <w:r>
+              <w:rPr>
+                <w:rFonts w:ascii="Consolas" w:cs="Consolas" w:eastAsia="Consolas" w:hAnsi="Consolas"/>
+                <w:b w:val="false"/>
+                <w:bCs w:val="false"/>
+                <w:color w:val="0C0E13"/>
+                <w:sz w:val="18"/>
+                <w:szCs w:val="18"/>
+              </w:rPr>
+              <w:t xml:space="preserve">100%</w:t>
+            </w:r>
+          </w:p>
+        </w:tc>
+        <w:tc>
+          <w:tcPr>
+            <w:tcW w:type="dxa" w:w="2760"/>
+            <w:tcBorders>
+              <w:top w:val="single" w:color="D9D5CB" w:sz="4"/>
+              <w:left w:val="single" w:color="D9D5CB" w:sz="4"/>
+              <w:bottom w:val="single" w:color="D9D5CB" w:sz="4"/>
+              <w:right w:val="single" w:color="D9D5CB" w:sz="4"/>
+            </w:tcBorders>
+            <w:tcMar>
+              <w:top w:type="dxa" w:w="70"/>
+              <w:left w:type="dxa" w:w="100"/>
+              <w:bottom w:type="dxa" w:w="70"/>
+              <w:right w:type="dxa" w:w="100"/>
+            </w:tcMar>
+          </w:tcPr>
+          <w:p>
+            <w:pPr>
+              <w:spacing w:after="0" w:line="252"/>
+            </w:pPr>
+            <w:r>
+              <w:rPr>
+                <w:rFonts w:ascii="Consolas" w:cs="Consolas" w:eastAsia="Consolas" w:hAnsi="Consolas"/>
+                <w:b w:val="false"/>
+                <w:bCs w:val="false"/>
+                <w:color w:val="0C0E13"/>
+                <w:sz w:val="18"/>
+                <w:szCs w:val="18"/>
+              </w:rPr>
+              <w:t xml:space="preserve">100%</w:t>
+            </w:r>
+          </w:p>
+        </w:tc>
+      </w:tr>
+      <w:tr>
+        <w:trPr>
+          <w:cantSplit/>
+        </w:trPr>
+        <w:tc>
+          <w:tcPr>
+            <w:tcW w:type="dxa" w:w="4400"/>
+            <w:tcBorders>
+              <w:top w:val="single" w:color="D9D5CB" w:sz="4"/>
+              <w:left w:val="single" w:color="D9D5CB" w:sz="4"/>
+              <w:bottom w:val="single" w:color="D9D5CB" w:sz="4"/>
+              <w:right w:val="single" w:color="D9D5CB" w:sz="4"/>
+            </w:tcBorders>
+            <w:tcMar>
+              <w:top w:type="dxa" w:w="70"/>
+              <w:left w:type="dxa" w:w="100"/>
+              <w:bottom w:type="dxa" w:w="70"/>
+              <w:right w:type="dxa" w:w="100"/>
+            </w:tcMar>
+          </w:tcPr>
+          <w:p>
+            <w:pPr>
+              <w:spacing w:after="0" w:line="252"/>
+            </w:pPr>
+            <w:r>
+              <w:rPr>
+                <w:rFonts w:ascii="Calibri" w:cs="Calibri" w:eastAsia="Calibri" w:hAnsi="Calibri"/>
+                <w:b w:val="false"/>
+                <w:bCs w:val="false"/>
+                <w:color w:val="0C0E13"/>
+                <w:sz w:val="18"/>
+                <w:szCs w:val="18"/>
+              </w:rPr>
+              <w:t xml:space="preserve">password assign</w:t>
+            </w:r>
+          </w:p>
+        </w:tc>
+        <w:tc>
+          <w:tcPr>
+            <w:tcW w:type="dxa" w:w="2200"/>
+            <w:tcBorders>
+              <w:top w:val="single" w:color="D9D5CB" w:sz="4"/>
+              <w:left w:val="single" w:color="D9D5CB" w:sz="4"/>
+              <w:bottom w:val="single" w:color="D9D5CB" w:sz="4"/>
+              <w:right w:val="single" w:color="D9D5CB" w:sz="4"/>
+            </w:tcBorders>
+            <w:tcMar>
+              <w:top w:type="dxa" w:w="70"/>
+              <w:left w:type="dxa" w:w="100"/>
+              <w:bottom w:type="dxa" w:w="70"/>
+              <w:right w:type="dxa" w:w="100"/>
+            </w:tcMar>
+          </w:tcPr>
+          <w:p>
+            <w:pPr>
+              <w:spacing w:after="0" w:line="252"/>
+            </w:pPr>
+            <w:r>
+              <w:rPr>
+                <w:rFonts w:ascii="Consolas" w:cs="Consolas" w:eastAsia="Consolas" w:hAnsi="Consolas"/>
+                <w:b w:val="false"/>
+                <w:bCs w:val="false"/>
+                <w:color w:val="0C0E13"/>
+                <w:sz w:val="18"/>
+                <w:szCs w:val="18"/>
+              </w:rPr>
+              <w:t xml:space="preserve">100%</w:t>
+            </w:r>
+          </w:p>
+        </w:tc>
+        <w:tc>
+          <w:tcPr>
+            <w:tcW w:type="dxa" w:w="2760"/>
+            <w:tcBorders>
+              <w:top w:val="single" w:color="D9D5CB" w:sz="4"/>
+              <w:left w:val="single" w:color="D9D5CB" w:sz="4"/>
+              <w:bottom w:val="single" w:color="D9D5CB" w:sz="4"/>
+              <w:right w:val="single" w:color="D9D5CB" w:sz="4"/>
+            </w:tcBorders>
+            <w:tcMar>
+              <w:top w:type="dxa" w:w="70"/>
+              <w:left w:type="dxa" w:w="100"/>
+              <w:bottom w:type="dxa" w:w="70"/>
+              <w:right w:type="dxa" w:w="100"/>
+            </w:tcMar>
+          </w:tcPr>
+          <w:p>
+            <w:pPr>
+              <w:spacing w:after="0" w:line="252"/>
+            </w:pPr>
+            <w:r>
+              <w:rPr>
+                <w:rFonts w:ascii="Consolas" w:cs="Consolas" w:eastAsia="Consolas" w:hAnsi="Consolas"/>
+                <w:b w:val="false"/>
+                <w:bCs w:val="false"/>
+                <w:color w:val="0C0E13"/>
+                <w:sz w:val="18"/>
+                <w:szCs w:val="18"/>
+              </w:rPr>
+              <w:t xml:space="preserve">100%</w:t>
+            </w:r>
+          </w:p>
+        </w:tc>
+      </w:tr>
+      <w:tr>
+        <w:trPr>
+          <w:cantSplit/>
+        </w:trPr>
+        <w:tc>
+          <w:tcPr>
+            <w:tcW w:type="dxa" w:w="4400"/>
+            <w:tcBorders>
+              <w:top w:val="single" w:color="D9D5CB" w:sz="4"/>
+              <w:left w:val="single" w:color="D9D5CB" w:sz="4"/>
+              <w:bottom w:val="single" w:color="D9D5CB" w:sz="4"/>
+              <w:right w:val="single" w:color="D9D5CB" w:sz="4"/>
+            </w:tcBorders>
+            <w:tcMar>
+              <w:top w:type="dxa" w:w="70"/>
+              <w:left w:type="dxa" w:w="100"/>
+              <w:bottom w:type="dxa" w:w="70"/>
+              <w:right w:type="dxa" w:w="100"/>
+            </w:tcMar>
+          </w:tcPr>
+          <w:p>
+            <w:pPr>
+              <w:spacing w:after="0" w:line="252"/>
+            </w:pPr>
+            <w:r>
+              <w:rPr>
+                <w:rFonts w:ascii="Calibri" w:cs="Calibri" w:eastAsia="Calibri" w:hAnsi="Calibri"/>
+                <w:b w:val="false"/>
+                <w:bCs w:val="false"/>
+                <w:color w:val="0C0E13"/>
+                <w:sz w:val="18"/>
+                <w:szCs w:val="18"/>
+              </w:rPr>
+              <w:t xml:space="preserve">api key json</w:t>
+            </w:r>
+          </w:p>
+        </w:tc>
+        <w:tc>
+          <w:tcPr>
+            <w:tcW w:type="dxa" w:w="2200"/>
+            <w:tcBorders>
+              <w:top w:val="single" w:color="D9D5CB" w:sz="4"/>
+              <w:left w:val="single" w:color="D9D5CB" w:sz="4"/>
+              <w:bottom w:val="single" w:color="D9D5CB" w:sz="4"/>
+              <w:right w:val="single" w:color="D9D5CB" w:sz="4"/>
+            </w:tcBorders>
+            <w:tcMar>
+              <w:top w:type="dxa" w:w="70"/>
+              <w:left w:type="dxa" w:w="100"/>
+              <w:bottom w:type="dxa" w:w="70"/>
+              <w:right w:type="dxa" w:w="100"/>
+            </w:tcMar>
+          </w:tcPr>
+          <w:p>
+            <w:pPr>
+              <w:spacing w:after="0" w:line="252"/>
+            </w:pPr>
+            <w:r>
+              <w:rPr>
+                <w:rFonts w:ascii="Consolas" w:cs="Consolas" w:eastAsia="Consolas" w:hAnsi="Consolas"/>
+                <w:b w:val="false"/>
+                <w:bCs w:val="false"/>
+                <w:color w:val="0C0E13"/>
+                <w:sz w:val="18"/>
+                <w:szCs w:val="18"/>
+              </w:rPr>
+              <w:t xml:space="preserve">100%</w:t>
+            </w:r>
+          </w:p>
+        </w:tc>
+        <w:tc>
+          <w:tcPr>
+            <w:tcW w:type="dxa" w:w="2760"/>
+            <w:tcBorders>
+              <w:top w:val="single" w:color="D9D5CB" w:sz="4"/>
+              <w:left w:val="single" w:color="D9D5CB" w:sz="4"/>
+              <w:bottom w:val="single" w:color="D9D5CB" w:sz="4"/>
+              <w:right w:val="single" w:color="D9D5CB" w:sz="4"/>
+            </w:tcBorders>
+            <w:tcMar>
+              <w:top w:type="dxa" w:w="70"/>
+              <w:left w:type="dxa" w:w="100"/>
+              <w:bottom w:type="dxa" w:w="70"/>
+              <w:right w:type="dxa" w:w="100"/>
+            </w:tcMar>
+          </w:tcPr>
+          <w:p>
+            <w:pPr>
+              <w:spacing w:after="0" w:line="252"/>
+            </w:pPr>
+            <w:r>
+              <w:rPr>
+                <w:rFonts w:ascii="Consolas" w:cs="Consolas" w:eastAsia="Consolas" w:hAnsi="Consolas"/>
+                <w:b w:val="false"/>
+                <w:bCs w:val="false"/>
+                <w:color w:val="0C0E13"/>
+                <w:sz w:val="18"/>
+                <w:szCs w:val="18"/>
+              </w:rPr>
+              <w:t xml:space="preserve">100%</w:t>
+            </w:r>
+          </w:p>
+        </w:tc>
+      </w:tr>
+      <w:tr>
+        <w:trPr>
+          <w:cantSplit/>
+        </w:trPr>
+        <w:tc>
+          <w:tcPr>
+            <w:tcW w:type="dxa" w:w="4400"/>
+            <w:tcBorders>
+              <w:top w:val="single" w:color="D9D5CB" w:sz="4"/>
+              <w:left w:val="single" w:color="D9D5CB" w:sz="4"/>
+              <w:bottom w:val="single" w:color="D9D5CB" w:sz="4"/>
+              <w:right w:val="single" w:color="D9D5CB" w:sz="4"/>
+            </w:tcBorders>
+            <w:tcMar>
+              <w:top w:type="dxa" w:w="70"/>
+              <w:left w:type="dxa" w:w="100"/>
+              <w:bottom w:type="dxa" w:w="70"/>
+              <w:right w:type="dxa" w:w="100"/>
+            </w:tcMar>
+          </w:tcPr>
+          <w:p>
+            <w:pPr>
+              <w:spacing w:after="0" w:line="252"/>
+            </w:pPr>
+            <w:r>
+              <w:rPr>
+                <w:rFonts w:ascii="Calibri" w:cs="Calibri" w:eastAsia="Calibri" w:hAnsi="Calibri"/>
+                <w:b w:val="false"/>
+                <w:bCs w:val="false"/>
+                <w:color w:val="0C0E13"/>
+                <w:sz w:val="18"/>
+                <w:szCs w:val="18"/>
+              </w:rPr>
               <w:t xml:space="preserve">token env</w:t>
             </w:r>
           </w:p>
@@ -10154,7 +10894,7 @@
                 <w:sz w:val="18"/>
                 <w:szCs w:val="18"/>
               </w:rPr>
-              <w:t xml:space="preserve">100%</w:t>
+              <w:t xml:space="preserve">99%</w:t>
             </w:r>
           </w:p>
         </w:tc>
@@ -10203,7 +10943,7 @@
         <w:pStyle w:val="Heading2"/>
       </w:pPr>
       <w:r>
-        <w:t xml:space="preserve">Formats with no pattern (9)</w:t>
+        <w:t xml:space="preserve">Formats with no pattern (5)</w:t>
       </w:r>
     </w:p>
     <w:tbl>
@@ -10651,290 +11391,6 @@
           </w:p>
         </w:tc>
       </w:tr>
-      <w:tr>
-        <w:trPr>
-          <w:cantSplit/>
-        </w:trPr>
-        <w:tc>
-          <w:tcPr>
-            <w:tcW w:type="dxa" w:w="6600"/>
-            <w:tcBorders>
-              <w:top w:val="single" w:color="D9D5CB" w:sz="4"/>
-              <w:left w:val="single" w:color="D9D5CB" w:sz="4"/>
-              <w:bottom w:val="single" w:color="D9D5CB" w:sz="4"/>
-              <w:right w:val="single" w:color="D9D5CB" w:sz="4"/>
-            </w:tcBorders>
-            <w:tcMar>
-              <w:top w:type="dxa" w:w="70"/>
-              <w:left w:type="dxa" w:w="100"/>
-              <w:bottom w:type="dxa" w:w="70"/>
-              <w:right w:type="dxa" w:w="100"/>
-            </w:tcMar>
-          </w:tcPr>
-          <w:p>
-            <w:pPr>
-              <w:spacing w:after="0" w:line="252"/>
-            </w:pPr>
-            <w:r>
-              <w:rPr>
-                <w:rFonts w:ascii="Calibri" w:cs="Calibri" w:eastAsia="Calibri" w:hAnsi="Calibri"/>
-                <w:b w:val="false"/>
-                <w:bCs w:val="false"/>
-                <w:color w:val="0C0E13"/>
-                <w:sz w:val="18"/>
-                <w:szCs w:val="18"/>
-              </w:rPr>
-              <w:t xml:space="preserve">digitalocean pat</w:t>
-            </w:r>
-          </w:p>
-        </w:tc>
-        <w:tc>
-          <w:tcPr>
-            <w:tcW w:type="dxa" w:w="2760"/>
-            <w:tcBorders>
-              <w:top w:val="single" w:color="D9D5CB" w:sz="4"/>
-              <w:left w:val="single" w:color="D9D5CB" w:sz="4"/>
-              <w:bottom w:val="single" w:color="D9D5CB" w:sz="4"/>
-              <w:right w:val="single" w:color="D9D5CB" w:sz="4"/>
-            </w:tcBorders>
-            <w:tcMar>
-              <w:top w:type="dxa" w:w="70"/>
-              <w:left w:type="dxa" w:w="100"/>
-              <w:bottom w:type="dxa" w:w="70"/>
-              <w:right w:type="dxa" w:w="100"/>
-            </w:tcMar>
-          </w:tcPr>
-          <w:p>
-            <w:pPr>
-              <w:spacing w:after="0" w:line="252"/>
-            </w:pPr>
-            <w:r>
-              <w:rPr>
-                <w:rFonts w:ascii="Consolas" w:cs="Consolas" w:eastAsia="Consolas" w:hAnsi="Consolas"/>
-                <w:b w:val="false"/>
-                <w:bCs w:val="false"/>
-                <w:color w:val="0C0E13"/>
-                <w:sz w:val="18"/>
-                <w:szCs w:val="18"/>
-              </w:rPr>
-              <w:t xml:space="preserve">0%</w:t>
-            </w:r>
-          </w:p>
-        </w:tc>
-      </w:tr>
-      <w:tr>
-        <w:trPr>
-          <w:cantSplit/>
-        </w:trPr>
-        <w:tc>
-          <w:tcPr>
-            <w:tcW w:type="dxa" w:w="6600"/>
-            <w:tcBorders>
-              <w:top w:val="single" w:color="D9D5CB" w:sz="4"/>
-              <w:left w:val="single" w:color="D9D5CB" w:sz="4"/>
-              <w:bottom w:val="single" w:color="D9D5CB" w:sz="4"/>
-              <w:right w:val="single" w:color="D9D5CB" w:sz="4"/>
-            </w:tcBorders>
-            <w:tcMar>
-              <w:top w:type="dxa" w:w="70"/>
-              <w:left w:type="dxa" w:w="100"/>
-              <w:bottom w:type="dxa" w:w="70"/>
-              <w:right w:type="dxa" w:w="100"/>
-            </w:tcMar>
-          </w:tcPr>
-          <w:p>
-            <w:pPr>
-              <w:spacing w:after="0" w:line="252"/>
-            </w:pPr>
-            <w:r>
-              <w:rPr>
-                <w:rFonts w:ascii="Calibri" w:cs="Calibri" w:eastAsia="Calibri" w:hAnsi="Calibri"/>
-                <w:b w:val="false"/>
-                <w:bCs w:val="false"/>
-                <w:color w:val="0C0E13"/>
-                <w:sz w:val="18"/>
-                <w:szCs w:val="18"/>
-              </w:rPr>
-              <w:t xml:space="preserve">shopify token</w:t>
-            </w:r>
-          </w:p>
-        </w:tc>
-        <w:tc>
-          <w:tcPr>
-            <w:tcW w:type="dxa" w:w="2760"/>
-            <w:tcBorders>
-              <w:top w:val="single" w:color="D9D5CB" w:sz="4"/>
-              <w:left w:val="single" w:color="D9D5CB" w:sz="4"/>
-              <w:bottom w:val="single" w:color="D9D5CB" w:sz="4"/>
-              <w:right w:val="single" w:color="D9D5CB" w:sz="4"/>
-            </w:tcBorders>
-            <w:tcMar>
-              <w:top w:type="dxa" w:w="70"/>
-              <w:left w:type="dxa" w:w="100"/>
-              <w:bottom w:type="dxa" w:w="70"/>
-              <w:right w:type="dxa" w:w="100"/>
-            </w:tcMar>
-          </w:tcPr>
-          <w:p>
-            <w:pPr>
-              <w:spacing w:after="0" w:line="252"/>
-            </w:pPr>
-            <w:r>
-              <w:rPr>
-                <w:rFonts w:ascii="Consolas" w:cs="Consolas" w:eastAsia="Consolas" w:hAnsi="Consolas"/>
-                <w:b w:val="false"/>
-                <w:bCs w:val="false"/>
-                <w:color w:val="0C0E13"/>
-                <w:sz w:val="18"/>
-                <w:szCs w:val="18"/>
-              </w:rPr>
-              <w:t xml:space="preserve">0%</w:t>
-            </w:r>
-          </w:p>
-        </w:tc>
-      </w:tr>
-      <w:tr>
-        <w:trPr>
-          <w:cantSplit/>
-        </w:trPr>
-        <w:tc>
-          <w:tcPr>
-            <w:tcW w:type="dxa" w:w="6600"/>
-            <w:tcBorders>
-              <w:top w:val="single" w:color="D9D5CB" w:sz="4"/>
-              <w:left w:val="single" w:color="D9D5CB" w:sz="4"/>
-              <w:bottom w:val="single" w:color="D9D5CB" w:sz="4"/>
-              <w:right w:val="single" w:color="D9D5CB" w:sz="4"/>
-            </w:tcBorders>
-            <w:tcMar>
-              <w:top w:type="dxa" w:w="70"/>
-              <w:left w:type="dxa" w:w="100"/>
-              <w:bottom w:type="dxa" w:w="70"/>
-              <w:right w:type="dxa" w:w="100"/>
-            </w:tcMar>
-          </w:tcPr>
-          <w:p>
-            <w:pPr>
-              <w:spacing w:after="0" w:line="252"/>
-            </w:pPr>
-            <w:r>
-              <w:rPr>
-                <w:rFonts w:ascii="Calibri" w:cs="Calibri" w:eastAsia="Calibri" w:hAnsi="Calibri"/>
-                <w:b w:val="false"/>
-                <w:bCs w:val="false"/>
-                <w:color w:val="0C0E13"/>
-                <w:sz w:val="18"/>
-                <w:szCs w:val="18"/>
-              </w:rPr>
-              <w:t xml:space="preserve">mailchimp key</w:t>
-            </w:r>
-          </w:p>
-        </w:tc>
-        <w:tc>
-          <w:tcPr>
-            <w:tcW w:type="dxa" w:w="2760"/>
-            <w:tcBorders>
-              <w:top w:val="single" w:color="D9D5CB" w:sz="4"/>
-              <w:left w:val="single" w:color="D9D5CB" w:sz="4"/>
-              <w:bottom w:val="single" w:color="D9D5CB" w:sz="4"/>
-              <w:right w:val="single" w:color="D9D5CB" w:sz="4"/>
-            </w:tcBorders>
-            <w:tcMar>
-              <w:top w:type="dxa" w:w="70"/>
-              <w:left w:type="dxa" w:w="100"/>
-              <w:bottom w:type="dxa" w:w="70"/>
-              <w:right w:type="dxa" w:w="100"/>
-            </w:tcMar>
-          </w:tcPr>
-          <w:p>
-            <w:pPr>
-              <w:spacing w:after="0" w:line="252"/>
-            </w:pPr>
-            <w:r>
-              <w:rPr>
-                <w:rFonts w:ascii="Consolas" w:cs="Consolas" w:eastAsia="Consolas" w:hAnsi="Consolas"/>
-                <w:b w:val="false"/>
-                <w:bCs w:val="false"/>
-                <w:color w:val="0C0E13"/>
-                <w:sz w:val="18"/>
-                <w:szCs w:val="18"/>
-              </w:rPr>
-              <w:t xml:space="preserve">0%</w:t>
-            </w:r>
-          </w:p>
-        </w:tc>
-      </w:tr>
-      <w:tr>
-        <w:trPr>
-          <w:cantSplit/>
-        </w:trPr>
-        <w:tc>
-          <w:tcPr>
-            <w:tcW w:type="dxa" w:w="6600"/>
-            <w:tcBorders>
-              <w:top w:val="single" w:color="D9D5CB" w:sz="4"/>
-              <w:left w:val="single" w:color="D9D5CB" w:sz="4"/>
-              <w:bottom w:val="single" w:color="D9D5CB" w:sz="4"/>
-              <w:right w:val="single" w:color="D9D5CB" w:sz="4"/>
-            </w:tcBorders>
-            <w:tcMar>
-              <w:top w:type="dxa" w:w="70"/>
-              <w:left w:type="dxa" w:w="100"/>
-              <w:bottom w:type="dxa" w:w="70"/>
-              <w:right w:type="dxa" w:w="100"/>
-            </w:tcMar>
-          </w:tcPr>
-          <w:p>
-            <w:pPr>
-              <w:spacing w:after="0" w:line="252"/>
-            </w:pPr>
-            <w:r>
-              <w:rPr>
-                <w:rFonts w:ascii="Calibri" w:cs="Calibri" w:eastAsia="Calibri" w:hAnsi="Calibri"/>
-                <w:b w:val="false"/>
-                <w:bCs w:val="false"/>
-                <w:color w:val="0C0E13"/>
-                <w:sz w:val="18"/>
-                <w:szCs w:val="18"/>
-              </w:rPr>
-              <w:t xml:space="preserve">telegram bot token</w:t>
-            </w:r>
-          </w:p>
-        </w:tc>
-        <w:tc>
-          <w:tcPr>
-            <w:tcW w:type="dxa" w:w="2760"/>
-            <w:tcBorders>
-              <w:top w:val="single" w:color="D9D5CB" w:sz="4"/>
-              <w:left w:val="single" w:color="D9D5CB" w:sz="4"/>
-              <w:bottom w:val="single" w:color="D9D5CB" w:sz="4"/>
-              <w:right w:val="single" w:color="D9D5CB" w:sz="4"/>
-            </w:tcBorders>
-            <w:tcMar>
-              <w:top w:type="dxa" w:w="70"/>
-              <w:left w:type="dxa" w:w="100"/>
-              <w:bottom w:type="dxa" w:w="70"/>
-              <w:right w:type="dxa" w:w="100"/>
-            </w:tcMar>
-          </w:tcPr>
-          <w:p>
-            <w:pPr>
-              <w:spacing w:after="0" w:line="252"/>
-            </w:pPr>
-            <w:r>
-              <w:rPr>
-                <w:rFonts w:ascii="Consolas" w:cs="Consolas" w:eastAsia="Consolas" w:hAnsi="Consolas"/>
-                <w:b w:val="false"/>
-                <w:bCs w:val="false"/>
-                <w:color w:val="0C0E13"/>
-                <w:sz w:val="18"/>
-                <w:szCs w:val="18"/>
-              </w:rPr>
-              <w:t xml:space="preserve">0%</w:t>
-            </w:r>
-          </w:p>
-        </w:tc>
-      </w:tr>
     </w:tbl>
     <w:p>
       <w:pPr>
@@ -10947,7 +11403,7 @@
           <w:sz w:val="20"/>
           <w:szCs w:val="20"/>
         </w:rPr>
-        <w:t xml:space="preserve">Random hex and base64 strings and short passwords are deliberately not flagged: doing so would flag hashes, IDs and placeholders. The scanner is best-effort.</w:t>
+        <w:t xml:space="preserve">Random hex and base64 strings and short passwords are deliberately not flagged: doing so would flag hashes, IDs and placeholders. The scanner is best-effort. Remaining hits on code are mostly test fixtures with literal passwords and very long minified lines.</w:t>
       </w:r>
     </w:p>
     <w:p>
@@ -11349,7 +11805,7 @@
                 <w:sz w:val="18"/>
                 <w:szCs w:val="18"/>
               </w:rPr>
-              <w:t xml:space="preserve">24</w:t>
+              <w:t xml:space="preserve">10</w:t>
             </w:r>
           </w:p>
         </w:tc>
@@ -11382,7 +11838,7 @@
                 <w:sz w:val="18"/>
                 <w:szCs w:val="18"/>
               </w:rPr>
-              <w:t xml:space="preserve">24.5</w:t>
+              <w:t xml:space="preserve">10.2</w:t>
             </w:r>
           </w:p>
         </w:tc>
@@ -11519,7 +11975,7 @@
                 <w:sz w:val="18"/>
                 <w:szCs w:val="18"/>
               </w:rPr>
-              <w:t xml:space="preserve">59</w:t>
+              <w:t xml:space="preserve">11</w:t>
             </w:r>
           </w:p>
         </w:tc>
@@ -11552,7 +12008,7 @@
                 <w:sz w:val="18"/>
                 <w:szCs w:val="18"/>
               </w:rPr>
-              <w:t xml:space="preserve">77.8</w:t>
+              <w:t xml:space="preserve">14.5</w:t>
             </w:r>
           </w:p>
         </w:tc>
@@ -11826,7 +12282,7 @@
                 <w:sz w:val="18"/>
                 <w:szCs w:val="18"/>
               </w:rPr>
-              <w:t xml:space="preserve">2,085</w:t>
+              <w:t xml:space="preserve">2,105</w:t>
             </w:r>
           </w:p>
         </w:tc>
@@ -11892,7 +12348,7 @@
                 <w:sz w:val="18"/>
                 <w:szCs w:val="18"/>
               </w:rPr>
-              <w:t xml:space="preserve">479.6</w:t>
+              <w:t xml:space="preserve">475.1</w:t>
             </w:r>
           </w:p>
         </w:tc>
@@ -11909,7 +12365,7 @@
           <w:sz w:val="20"/>
           <w:szCs w:val="20"/>
         </w:rPr>
-        <w:t xml:space="preserve">Example false positive: self.tokens = TokenQueue(tokens[::-1])</w:t>
+        <w:t xml:space="preserve">Example of a flagged line: passwd = 'my1pa$$word!'</w:t>
       </w:r>
     </w:p>
     <w:p>
@@ -11944,7 +12400,7 @@
           <w:sz w:val="22"/>
           <w:szCs w:val="22"/>
         </w:rPr>
-        <w:t xml:space="preserve">15 of 15 repeated runs passed (31 tests per run, median 7.1 s).</w:t>
+        <w:t xml:space="preserve">15 of 15 repeated runs passed (36 tests per run, median 12.0 s).</w:t>
       </w:r>
     </w:p>
     <w:tbl>
@@ -12206,7 +12662,7 @@
                 <w:sz w:val="18"/>
                 <w:szCs w:val="18"/>
               </w:rPr>
-              <w:t xml:space="preserve">31</w:t>
+              <w:t xml:space="preserve">36</w:t>
             </w:r>
           </w:p>
         </w:tc>
@@ -12239,7 +12695,7 @@
                 <w:sz w:val="18"/>
                 <w:szCs w:val="18"/>
               </w:rPr>
-              <w:t xml:space="preserve">6.3 s</w:t>
+              <w:t xml:space="preserve">10.9 s</w:t>
             </w:r>
           </w:p>
         </w:tc>
@@ -12343,7 +12799,7 @@
                 <w:sz w:val="18"/>
                 <w:szCs w:val="18"/>
               </w:rPr>
-              <w:t xml:space="preserve">31</w:t>
+              <w:t xml:space="preserve">36</w:t>
             </w:r>
           </w:p>
         </w:tc>
@@ -12376,7 +12832,7 @@
                 <w:sz w:val="18"/>
                 <w:szCs w:val="18"/>
               </w:rPr>
-              <w:t xml:space="preserve">7.0 s</w:t>
+              <w:t xml:space="preserve">13.0 s</w:t>
             </w:r>
           </w:p>
         </w:tc>
@@ -12406,7 +12862,7 @@
           <w:sz w:val="22"/>
           <w:szCs w:val="22"/>
         </w:rPr>
-        <w:t xml:space="preserve">Several processes run "contextbridge run -- true" in the same repository at once. Each reads the state, appends an entry and writes it back.</w:t>
+        <w:t xml:space="preserve">Several processes run "contextbridge run -- true" in the same repository at once. Writers take an exclusive lock around reading and writing the notes, so entries from different processes do not overwrite each other.</w:t>
       </w:r>
     </w:p>
     <w:p>
@@ -12418,9 +12874,9 @@
       <w:r>
         <w:drawing>
           <wp:inline distT="0" distB="0" distL="0" distR="0">
-            <wp:extent cx="3810000" cy="1962150"/>
+            <wp:extent cx="3810000" cy="1981200"/>
             <wp:effectExtent t="0" r="0" b="0" l="0"/>
-            <wp:docPr id="7" name="concurrency.png" descr="Figure 7. Evidence entries executed versus recorded." title="Figure 7. Evidence entries executed versus recorded."/>
+            <wp:docPr id="7" name="concurrency.png" descr="Figure 7. Evidence entries executed versus recorded under parallel writers." title="Figure 7. Evidence entries executed versus recorded under parallel writers."/>
             <wp:cNvGraphicFramePr>
               <a:graphicFrameLocks xmlns:a="http://schemas.openxmlformats.org/drawingml/2006/main" noChangeAspect="1"/>
             </wp:cNvGraphicFramePr>
@@ -12443,7 +12899,7 @@
                   <pic:spPr bwMode="auto">
                     <a:xfrm>
                       <a:off x="0" y="0"/>
-                      <a:ext cx="3810000" cy="1962150"/>
+                      <a:ext cx="3810000" cy="1981200"/>
                     </a:xfrm>
                     <a:prstGeom prst="rect">
                       <a:avLst/>
@@ -12470,7 +12926,7 @@
           <w:sz w:val="18"/>
           <w:szCs w:val="18"/>
         </w:rPr>
-        <w:t xml:space="preserve">Figure 7. Evidence entries executed versus recorded.</w:t>
+        <w:t xml:space="preserve">Figure 7. Evidence entries executed versus recorded under parallel writers.</w:t>
       </w:r>
     </w:p>
     <w:tbl>
@@ -12835,7 +13291,7 @@
                 <w:sz w:val="18"/>
                 <w:szCs w:val="18"/>
               </w:rPr>
-              <w:t xml:space="preserve">10</w:t>
+              <w:t xml:space="preserve">20</w:t>
             </w:r>
           </w:p>
         </w:tc>
@@ -12868,7 +13324,7 @@
                 <w:sz w:val="18"/>
                 <w:szCs w:val="18"/>
               </w:rPr>
-              <w:t xml:space="preserve">10</w:t>
+              <w:t xml:space="preserve">0</w:t>
             </w:r>
           </w:p>
         </w:tc>
@@ -13038,7 +13494,7 @@
                 <w:sz w:val="18"/>
                 <w:szCs w:val="18"/>
               </w:rPr>
-              <w:t xml:space="preserve">10</w:t>
+              <w:t xml:space="preserve">40</w:t>
             </w:r>
           </w:p>
         </w:tc>
@@ -13071,7 +13527,7 @@
                 <w:sz w:val="18"/>
                 <w:szCs w:val="18"/>
               </w:rPr>
-              <w:t xml:space="preserve">30</w:t>
+              <w:t xml:space="preserve">0</w:t>
             </w:r>
           </w:p>
         </w:tc>
@@ -13241,7 +13697,7 @@
                 <w:sz w:val="18"/>
                 <w:szCs w:val="18"/>
               </w:rPr>
-              <w:t xml:space="preserve">5</w:t>
+              <w:t xml:space="preserve">40</w:t>
             </w:r>
           </w:p>
         </w:tc>
@@ -13274,7 +13730,7 @@
                 <w:sz w:val="18"/>
                 <w:szCs w:val="18"/>
               </w:rPr>
-              <w:t xml:space="preserve">35</w:t>
+              <w:t xml:space="preserve">0</w:t>
             </w:r>
           </w:p>
         </w:tc>
@@ -13324,7 +13780,7 @@
           <w:sz w:val="20"/>
           <w:szCs w:val="20"/>
         </w:rPr>
-        <w:t xml:space="preserve">Writes are atomic, so the file never corrupts, but later writes overwrite earlier ones and entries are lost.</w:t>
+        <w:t xml:space="preserve">The notes stayed valid JSON in every run, and every executed test run was recorded with a unique id.</w:t>
       </w:r>
     </w:p>
     <w:p>
@@ -13491,7 +13947,7 @@
                 <w:sz w:val="18"/>
                 <w:szCs w:val="18"/>
               </w:rPr>
-              <w:t xml:space="preserve">23,208 / 32,380 bytes</w:t>
+              <w:t xml:space="preserve">25,002 / 35,062 bytes</w:t>
             </w:r>
           </w:p>
         </w:tc>
@@ -13704,7 +14160,7 @@
                 <w:sz w:val="18"/>
                 <w:szCs w:val="18"/>
               </w:rPr>
-              <w:t xml:space="preserve">ok in 1.0 s; --version 0.3.2; end-to-end smoke test passed</w:t>
+              <w:t xml:space="preserve">ok in 1.0 s; --version 0.3.3; end-to-end smoke test passed</w:t>
             </w:r>
           </w:p>
         </w:tc>
@@ -13775,7 +14231,7 @@
                 <w:sz w:val="18"/>
                 <w:szCs w:val="18"/>
               </w:rPr>
-              <w:t xml:space="preserve">ok in 2.1 s; --version 0.3.2; end-to-end smoke test passed</w:t>
+              <w:t xml:space="preserve">ok in 0.9 s; --version 0.3.3; end-to-end smoke test passed</w:t>
             </w:r>
           </w:p>
         </w:tc>
@@ -13786,1245 +14242,7 @@
         <w:pStyle w:val="Heading1"/>
       </w:pPr>
       <w:r>
-        <w:t xml:space="preserve">7. Findings</w:t>
-      </w:r>
-    </w:p>
-    <w:tbl>
-      <w:tblPr>
-        <w:tblW w:type="dxa" w:w="9360"/>
-        <w:tblBorders>
-          <w:top w:val="single" w:color="auto" w:sz="4"/>
-          <w:left w:val="single" w:color="auto" w:sz="4"/>
-          <w:bottom w:val="single" w:color="auto" w:sz="4"/>
-          <w:right w:val="single" w:color="auto" w:sz="4"/>
-          <w:insideH w:val="single" w:color="auto" w:sz="4"/>
-          <w:insideV w:val="single" w:color="auto" w:sz="4"/>
-        </w:tblBorders>
-      </w:tblPr>
-      <w:tblGrid>
-        <w:gridCol w:w="520"/>
-        <w:gridCol w:w="2200"/>
-        <w:gridCol w:w="3000"/>
-        <w:gridCol w:w="2600"/>
-        <w:gridCol w:w="1040"/>
-      </w:tblGrid>
-      <w:tr>
-        <w:trPr>
-          <w:cantSplit/>
-          <w:tblHeader/>
-        </w:trPr>
-        <w:tc>
-          <w:tcPr>
-            <w:tcW w:type="dxa" w:w="520"/>
-            <w:tcBorders>
-              <w:top w:val="single" w:color="D9D5CB" w:sz="4"/>
-              <w:left w:val="single" w:color="D9D5CB" w:sz="4"/>
-              <w:bottom w:val="single" w:color="D9D5CB" w:sz="4"/>
-              <w:right w:val="single" w:color="D9D5CB" w:sz="4"/>
-            </w:tcBorders>
-            <w:shd w:fill="ECE8DF" w:val="clear"/>
-            <w:tcMar>
-              <w:top w:type="dxa" w:w="70"/>
-              <w:left w:type="dxa" w:w="100"/>
-              <w:bottom w:type="dxa" w:w="70"/>
-              <w:right w:type="dxa" w:w="100"/>
-            </w:tcMar>
-          </w:tcPr>
-          <w:p>
-            <w:pPr>
-              <w:spacing w:after="0" w:line="252"/>
-            </w:pPr>
-            <w:r>
-              <w:rPr>
-                <w:rFonts w:ascii="Calibri" w:cs="Calibri" w:eastAsia="Calibri" w:hAnsi="Calibri"/>
-                <w:b/>
-                <w:bCs/>
-                <w:color w:val="0C0E13"/>
-                <w:sz w:val="16"/>
-                <w:szCs w:val="16"/>
-              </w:rPr>
-              <w:t xml:space="preserve">#</w:t>
-            </w:r>
-          </w:p>
-        </w:tc>
-        <w:tc>
-          <w:tcPr>
-            <w:tcW w:type="dxa" w:w="2200"/>
-            <w:tcBorders>
-              <w:top w:val="single" w:color="D9D5CB" w:sz="4"/>
-              <w:left w:val="single" w:color="D9D5CB" w:sz="4"/>
-              <w:bottom w:val="single" w:color="D9D5CB" w:sz="4"/>
-              <w:right w:val="single" w:color="D9D5CB" w:sz="4"/>
-            </w:tcBorders>
-            <w:shd w:fill="ECE8DF" w:val="clear"/>
-            <w:tcMar>
-              <w:top w:type="dxa" w:w="70"/>
-              <w:left w:type="dxa" w:w="100"/>
-              <w:bottom w:type="dxa" w:w="70"/>
-              <w:right w:type="dxa" w:w="100"/>
-            </w:tcMar>
-          </w:tcPr>
-          <w:p>
-            <w:pPr>
-              <w:spacing w:after="0" w:line="252"/>
-            </w:pPr>
-            <w:r>
-              <w:rPr>
-                <w:rFonts w:ascii="Calibri" w:cs="Calibri" w:eastAsia="Calibri" w:hAnsi="Calibri"/>
-                <w:b/>
-                <w:bCs/>
-                <w:color w:val="0C0E13"/>
-                <w:sz w:val="16"/>
-                <w:szCs w:val="16"/>
-              </w:rPr>
-              <w:t xml:space="preserve">Finding</w:t>
-            </w:r>
-          </w:p>
-        </w:tc>
-        <w:tc>
-          <w:tcPr>
-            <w:tcW w:type="dxa" w:w="3000"/>
-            <w:tcBorders>
-              <w:top w:val="single" w:color="D9D5CB" w:sz="4"/>
-              <w:left w:val="single" w:color="D9D5CB" w:sz="4"/>
-              <w:bottom w:val="single" w:color="D9D5CB" w:sz="4"/>
-              <w:right w:val="single" w:color="D9D5CB" w:sz="4"/>
-            </w:tcBorders>
-            <w:shd w:fill="ECE8DF" w:val="clear"/>
-            <w:tcMar>
-              <w:top w:type="dxa" w:w="70"/>
-              <w:left w:type="dxa" w:w="100"/>
-              <w:bottom w:type="dxa" w:w="70"/>
-              <w:right w:type="dxa" w:w="100"/>
-            </w:tcMar>
-          </w:tcPr>
-          <w:p>
-            <w:pPr>
-              <w:spacing w:after="0" w:line="252"/>
-            </w:pPr>
-            <w:r>
-              <w:rPr>
-                <w:rFonts w:ascii="Calibri" w:cs="Calibri" w:eastAsia="Calibri" w:hAnsi="Calibri"/>
-                <w:b/>
-                <w:bCs/>
-                <w:color w:val="0C0E13"/>
-                <w:sz w:val="16"/>
-                <w:szCs w:val="16"/>
-              </w:rPr>
-              <w:t xml:space="preserve">Evidence</w:t>
-            </w:r>
-          </w:p>
-        </w:tc>
-        <w:tc>
-          <w:tcPr>
-            <w:tcW w:type="dxa" w:w="2600"/>
-            <w:tcBorders>
-              <w:top w:val="single" w:color="D9D5CB" w:sz="4"/>
-              <w:left w:val="single" w:color="D9D5CB" w:sz="4"/>
-              <w:bottom w:val="single" w:color="D9D5CB" w:sz="4"/>
-              <w:right w:val="single" w:color="D9D5CB" w:sz="4"/>
-            </w:tcBorders>
-            <w:shd w:fill="ECE8DF" w:val="clear"/>
-            <w:tcMar>
-              <w:top w:type="dxa" w:w="70"/>
-              <w:left w:type="dxa" w:w="100"/>
-              <w:bottom w:type="dxa" w:w="70"/>
-              <w:right w:type="dxa" w:w="100"/>
-            </w:tcMar>
-          </w:tcPr>
-          <w:p>
-            <w:pPr>
-              <w:spacing w:after="0" w:line="252"/>
-            </w:pPr>
-            <w:r>
-              <w:rPr>
-                <w:rFonts w:ascii="Calibri" w:cs="Calibri" w:eastAsia="Calibri" w:hAnsi="Calibri"/>
-                <w:b/>
-                <w:bCs/>
-                <w:color w:val="0C0E13"/>
-                <w:sz w:val="16"/>
-                <w:szCs w:val="16"/>
-              </w:rPr>
-              <w:t xml:space="preserve">Suggested fix</w:t>
-            </w:r>
-          </w:p>
-        </w:tc>
-        <w:tc>
-          <w:tcPr>
-            <w:tcW w:type="dxa" w:w="1040"/>
-            <w:tcBorders>
-              <w:top w:val="single" w:color="D9D5CB" w:sz="4"/>
-              <w:left w:val="single" w:color="D9D5CB" w:sz="4"/>
-              <w:bottom w:val="single" w:color="D9D5CB" w:sz="4"/>
-              <w:right w:val="single" w:color="D9D5CB" w:sz="4"/>
-            </w:tcBorders>
-            <w:shd w:fill="ECE8DF" w:val="clear"/>
-            <w:tcMar>
-              <w:top w:type="dxa" w:w="70"/>
-              <w:left w:type="dxa" w:w="100"/>
-              <w:bottom w:type="dxa" w:w="70"/>
-              <w:right w:type="dxa" w:w="100"/>
-            </w:tcMar>
-          </w:tcPr>
-          <w:p>
-            <w:pPr>
-              <w:spacing w:after="0" w:line="252"/>
-            </w:pPr>
-            <w:r>
-              <w:rPr>
-                <w:rFonts w:ascii="Calibri" w:cs="Calibri" w:eastAsia="Calibri" w:hAnsi="Calibri"/>
-                <w:b/>
-                <w:bCs/>
-                <w:color w:val="0C0E13"/>
-                <w:sz w:val="16"/>
-                <w:szCs w:val="16"/>
-              </w:rPr>
-              <w:t xml:space="preserve">Severity</w:t>
-            </w:r>
-          </w:p>
-        </w:tc>
-      </w:tr>
-      <w:tr>
-        <w:trPr>
-          <w:cantSplit/>
-        </w:trPr>
-        <w:tc>
-          <w:tcPr>
-            <w:tcW w:type="dxa" w:w="520"/>
-            <w:tcBorders>
-              <w:top w:val="single" w:color="D9D5CB" w:sz="4"/>
-              <w:left w:val="single" w:color="D9D5CB" w:sz="4"/>
-              <w:bottom w:val="single" w:color="D9D5CB" w:sz="4"/>
-              <w:right w:val="single" w:color="D9D5CB" w:sz="4"/>
-            </w:tcBorders>
-            <w:tcMar>
-              <w:top w:type="dxa" w:w="70"/>
-              <w:left w:type="dxa" w:w="100"/>
-              <w:bottom w:type="dxa" w:w="70"/>
-              <w:right w:type="dxa" w:w="100"/>
-            </w:tcMar>
-          </w:tcPr>
-          <w:p>
-            <w:pPr>
-              <w:spacing w:after="0" w:line="252"/>
-            </w:pPr>
-            <w:r>
-              <w:rPr>
-                <w:rFonts w:ascii="Calibri" w:cs="Calibri" w:eastAsia="Calibri" w:hAnsi="Calibri"/>
-                <w:b w:val="false"/>
-                <w:bCs w:val="false"/>
-                <w:color w:val="0C0E13"/>
-                <w:sz w:val="16"/>
-                <w:szCs w:val="16"/>
-              </w:rPr>
-              <w:t xml:space="preserve">N1</w:t>
-            </w:r>
-          </w:p>
-        </w:tc>
-        <w:tc>
-          <w:tcPr>
-            <w:tcW w:type="dxa" w:w="2200"/>
-            <w:tcBorders>
-              <w:top w:val="single" w:color="D9D5CB" w:sz="4"/>
-              <w:left w:val="single" w:color="D9D5CB" w:sz="4"/>
-              <w:bottom w:val="single" w:color="D9D5CB" w:sz="4"/>
-              <w:right w:val="single" w:color="D9D5CB" w:sz="4"/>
-            </w:tcBorders>
-            <w:tcMar>
-              <w:top w:type="dxa" w:w="70"/>
-              <w:left w:type="dxa" w:w="100"/>
-              <w:bottom w:type="dxa" w:w="70"/>
-              <w:right w:type="dxa" w:w="100"/>
-            </w:tcMar>
-          </w:tcPr>
-          <w:p>
-            <w:pPr>
-              <w:spacing w:after="0" w:line="252"/>
-            </w:pPr>
-            <w:r>
-              <w:rPr>
-                <w:rFonts w:ascii="Calibri" w:cs="Calibri" w:eastAsia="Calibri" w:hAnsi="Calibri"/>
-                <w:b w:val="false"/>
-                <w:bCs w:val="false"/>
-                <w:color w:val="0C0E13"/>
-                <w:sz w:val="16"/>
-                <w:szCs w:val="16"/>
-              </w:rPr>
-              <w:t xml:space="preserve">Concurrent writers silently lose evidence</w:t>
-            </w:r>
-          </w:p>
-        </w:tc>
-        <w:tc>
-          <w:tcPr>
-            <w:tcW w:type="dxa" w:w="3000"/>
-            <w:tcBorders>
-              <w:top w:val="single" w:color="D9D5CB" w:sz="4"/>
-              <w:left w:val="single" w:color="D9D5CB" w:sz="4"/>
-              <w:bottom w:val="single" w:color="D9D5CB" w:sz="4"/>
-              <w:right w:val="single" w:color="D9D5CB" w:sz="4"/>
-            </w:tcBorders>
-            <w:tcMar>
-              <w:top w:type="dxa" w:w="70"/>
-              <w:left w:type="dxa" w:w="100"/>
-              <w:bottom w:type="dxa" w:w="70"/>
-              <w:right w:type="dxa" w:w="100"/>
-            </w:tcMar>
-          </w:tcPr>
-          <w:p>
-            <w:pPr>
-              <w:spacing w:after="0" w:line="252"/>
-            </w:pPr>
-            <w:r>
-              <w:rPr>
-                <w:rFonts w:ascii="Calibri" w:cs="Calibri" w:eastAsia="Calibri" w:hAnsi="Calibri"/>
-                <w:b w:val="false"/>
-                <w:bCs w:val="false"/>
-                <w:color w:val="0C0E13"/>
-                <w:sz w:val="16"/>
-                <w:szCs w:val="16"/>
-              </w:rPr>
-              <w:t xml:space="preserve">8 parallel writers ran 40 test runs; only 5 were recorded (35 lost). state.json always stayed valid JSON because writes are atomic.</w:t>
-            </w:r>
-          </w:p>
-        </w:tc>
-        <w:tc>
-          <w:tcPr>
-            <w:tcW w:type="dxa" w:w="2600"/>
-            <w:tcBorders>
-              <w:top w:val="single" w:color="D9D5CB" w:sz="4"/>
-              <w:left w:val="single" w:color="D9D5CB" w:sz="4"/>
-              <w:bottom w:val="single" w:color="D9D5CB" w:sz="4"/>
-              <w:right w:val="single" w:color="D9D5CB" w:sz="4"/>
-            </w:tcBorders>
-            <w:tcMar>
-              <w:top w:type="dxa" w:w="70"/>
-              <w:left w:type="dxa" w:w="100"/>
-              <w:bottom w:type="dxa" w:w="70"/>
-              <w:right w:type="dxa" w:w="100"/>
-            </w:tcMar>
-          </w:tcPr>
-          <w:p>
-            <w:pPr>
-              <w:spacing w:after="0" w:line="252"/>
-            </w:pPr>
-            <w:r>
-              <w:rPr>
-                <w:rFonts w:ascii="Calibri" w:cs="Calibri" w:eastAsia="Calibri" w:hAnsi="Calibri"/>
-                <w:b w:val="false"/>
-                <w:bCs w:val="false"/>
-                <w:color w:val="0C0E13"/>
-                <w:sz w:val="16"/>
-                <w:szCs w:val="16"/>
-              </w:rPr>
-              <w:t xml:space="preserve">Lock the read-modify-write of the state files (flock on POSIX, msvcrt on Windows) and reload before each save.</w:t>
-            </w:r>
-          </w:p>
-        </w:tc>
-        <w:tc>
-          <w:tcPr>
-            <w:tcW w:type="dxa" w:w="1040"/>
-            <w:tcBorders>
-              <w:top w:val="single" w:color="D9D5CB" w:sz="4"/>
-              <w:left w:val="single" w:color="D9D5CB" w:sz="4"/>
-              <w:bottom w:val="single" w:color="D9D5CB" w:sz="4"/>
-              <w:right w:val="single" w:color="D9D5CB" w:sz="4"/>
-            </w:tcBorders>
-            <w:tcMar>
-              <w:top w:type="dxa" w:w="70"/>
-              <w:left w:type="dxa" w:w="100"/>
-              <w:bottom w:type="dxa" w:w="70"/>
-              <w:right w:type="dxa" w:w="100"/>
-            </w:tcMar>
-          </w:tcPr>
-          <w:p>
-            <w:pPr>
-              <w:spacing w:after="0" w:line="252"/>
-            </w:pPr>
-            <w:r>
-              <w:rPr>
-                <w:rFonts w:ascii="Calibri" w:cs="Calibri" w:eastAsia="Calibri" w:hAnsi="Calibri"/>
-                <w:b w:val="false"/>
-                <w:bCs w:val="false"/>
-                <w:color w:val="0C0E13"/>
-                <w:sz w:val="16"/>
-                <w:szCs w:val="16"/>
-              </w:rPr>
-              <w:t xml:space="preserve">medium</w:t>
-            </w:r>
-          </w:p>
-        </w:tc>
-      </w:tr>
-      <w:tr>
-        <w:trPr>
-          <w:cantSplit/>
-        </w:trPr>
-        <w:tc>
-          <w:tcPr>
-            <w:tcW w:type="dxa" w:w="520"/>
-            <w:tcBorders>
-              <w:top w:val="single" w:color="D9D5CB" w:sz="4"/>
-              <w:left w:val="single" w:color="D9D5CB" w:sz="4"/>
-              <w:bottom w:val="single" w:color="D9D5CB" w:sz="4"/>
-              <w:right w:val="single" w:color="D9D5CB" w:sz="4"/>
-            </w:tcBorders>
-            <w:tcMar>
-              <w:top w:type="dxa" w:w="70"/>
-              <w:left w:type="dxa" w:w="100"/>
-              <w:bottom w:type="dxa" w:w="70"/>
-              <w:right w:type="dxa" w:w="100"/>
-            </w:tcMar>
-          </w:tcPr>
-          <w:p>
-            <w:pPr>
-              <w:spacing w:after="0" w:line="252"/>
-            </w:pPr>
-            <w:r>
-              <w:rPr>
-                <w:rFonts w:ascii="Calibri" w:cs="Calibri" w:eastAsia="Calibri" w:hAnsi="Calibri"/>
-                <w:b w:val="false"/>
-                <w:bCs w:val="false"/>
-                <w:color w:val="0C0E13"/>
-                <w:sz w:val="16"/>
-                <w:szCs w:val="16"/>
-              </w:rPr>
-              <w:t xml:space="preserve">N2</w:t>
-            </w:r>
-          </w:p>
-        </w:tc>
-        <w:tc>
-          <w:tcPr>
-            <w:tcW w:type="dxa" w:w="2200"/>
-            <w:tcBorders>
-              <w:top w:val="single" w:color="D9D5CB" w:sz="4"/>
-              <w:left w:val="single" w:color="D9D5CB" w:sz="4"/>
-              <w:bottom w:val="single" w:color="D9D5CB" w:sz="4"/>
-              <w:right w:val="single" w:color="D9D5CB" w:sz="4"/>
-            </w:tcBorders>
-            <w:tcMar>
-              <w:top w:type="dxa" w:w="70"/>
-              <w:left w:type="dxa" w:w="100"/>
-              <w:bottom w:type="dxa" w:w="70"/>
-              <w:right w:type="dxa" w:w="100"/>
-            </w:tcMar>
-          </w:tcPr>
-          <w:p>
-            <w:pPr>
-              <w:spacing w:after="0" w:line="252"/>
-            </w:pPr>
-            <w:r>
-              <w:rPr>
-                <w:rFonts w:ascii="Calibri" w:cs="Calibri" w:eastAsia="Calibri" w:hAnsi="Calibri"/>
-                <w:b w:val="false"/>
-                <w:bCs w:val="false"/>
-                <w:color w:val="0C0E13"/>
-                <w:sz w:val="16"/>
-                <w:szCs w:val="16"/>
-              </w:rPr>
-              <w:t xml:space="preserve">A malformed state.json crashes `resume` instead of returning BLOCKED</w:t>
-            </w:r>
-          </w:p>
-        </w:tc>
-        <w:tc>
-          <w:tcPr>
-            <w:tcW w:type="dxa" w:w="3000"/>
-            <w:tcBorders>
-              <w:top w:val="single" w:color="D9D5CB" w:sz="4"/>
-              <w:left w:val="single" w:color="D9D5CB" w:sz="4"/>
-              <w:bottom w:val="single" w:color="D9D5CB" w:sz="4"/>
-              <w:right w:val="single" w:color="D9D5CB" w:sz="4"/>
-            </w:tcBorders>
-            <w:tcMar>
-              <w:top w:type="dxa" w:w="70"/>
-              <w:left w:type="dxa" w:w="100"/>
-              <w:bottom w:type="dxa" w:w="70"/>
-              <w:right w:type="dxa" w:w="100"/>
-            </w:tcMar>
-          </w:tcPr>
-          <w:p>
-            <w:pPr>
-              <w:spacing w:after="0" w:line="252"/>
-            </w:pPr>
-            <w:r>
-              <w:rPr>
-                <w:rFonts w:ascii="Calibri" w:cs="Calibri" w:eastAsia="Calibri" w:hAnsi="Calibri"/>
-                <w:b w:val="false"/>
-                <w:bCs w:val="false"/>
-                <w:color w:val="0C0E13"/>
-                <w:sz w:val="16"/>
-                <w:szCs w:val="16"/>
-              </w:rPr>
-              <w:t xml:space="preserve">A state.json containing a JSON list produced a Python traceback (AttributeError: 'list' object has no attribute 'get') rather than a BLOCKED verdict.</w:t>
-            </w:r>
-          </w:p>
-        </w:tc>
-        <w:tc>
-          <w:tcPr>
-            <w:tcW w:type="dxa" w:w="2600"/>
-            <w:tcBorders>
-              <w:top w:val="single" w:color="D9D5CB" w:sz="4"/>
-              <w:left w:val="single" w:color="D9D5CB" w:sz="4"/>
-              <w:bottom w:val="single" w:color="D9D5CB" w:sz="4"/>
-              <w:right w:val="single" w:color="D9D5CB" w:sz="4"/>
-            </w:tcBorders>
-            <w:tcMar>
-              <w:top w:type="dxa" w:w="70"/>
-              <w:left w:type="dxa" w:w="100"/>
-              <w:bottom w:type="dxa" w:w="70"/>
-              <w:right w:type="dxa" w:w="100"/>
-            </w:tcMar>
-          </w:tcPr>
-          <w:p>
-            <w:pPr>
-              <w:spacing w:after="0" w:line="252"/>
-            </w:pPr>
-            <w:r>
-              <w:rPr>
-                <w:rFonts w:ascii="Calibri" w:cs="Calibri" w:eastAsia="Calibri" w:hAnsi="Calibri"/>
-                <w:b w:val="false"/>
-                <w:bCs w:val="false"/>
-                <w:color w:val="0C0E13"/>
-                <w:sz w:val="16"/>
-                <w:szCs w:val="16"/>
-              </w:rPr>
-              <w:t xml:space="preserve">Validate that the top level is an object when loading and route anything else to the existing 'not valid' BLOCKED path.</w:t>
-            </w:r>
-          </w:p>
-        </w:tc>
-        <w:tc>
-          <w:tcPr>
-            <w:tcW w:type="dxa" w:w="1040"/>
-            <w:tcBorders>
-              <w:top w:val="single" w:color="D9D5CB" w:sz="4"/>
-              <w:left w:val="single" w:color="D9D5CB" w:sz="4"/>
-              <w:bottom w:val="single" w:color="D9D5CB" w:sz="4"/>
-              <w:right w:val="single" w:color="D9D5CB" w:sz="4"/>
-            </w:tcBorders>
-            <w:tcMar>
-              <w:top w:type="dxa" w:w="70"/>
-              <w:left w:type="dxa" w:w="100"/>
-              <w:bottom w:type="dxa" w:w="70"/>
-              <w:right w:type="dxa" w:w="100"/>
-            </w:tcMar>
-          </w:tcPr>
-          <w:p>
-            <w:pPr>
-              <w:spacing w:after="0" w:line="252"/>
-            </w:pPr>
-            <w:r>
-              <w:rPr>
-                <w:rFonts w:ascii="Calibri" w:cs="Calibri" w:eastAsia="Calibri" w:hAnsi="Calibri"/>
-                <w:b w:val="false"/>
-                <w:bCs w:val="false"/>
-                <w:color w:val="0C0E13"/>
-                <w:sz w:val="16"/>
-                <w:szCs w:val="16"/>
-              </w:rPr>
-              <w:t xml:space="preserve">medium</w:t>
-            </w:r>
-          </w:p>
-        </w:tc>
-      </w:tr>
-      <w:tr>
-        <w:trPr>
-          <w:cantSplit/>
-        </w:trPr>
-        <w:tc>
-          <w:tcPr>
-            <w:tcW w:type="dxa" w:w="520"/>
-            <w:tcBorders>
-              <w:top w:val="single" w:color="D9D5CB" w:sz="4"/>
-              <w:left w:val="single" w:color="D9D5CB" w:sz="4"/>
-              <w:bottom w:val="single" w:color="D9D5CB" w:sz="4"/>
-              <w:right w:val="single" w:color="D9D5CB" w:sz="4"/>
-            </w:tcBorders>
-            <w:tcMar>
-              <w:top w:type="dxa" w:w="70"/>
-              <w:left w:type="dxa" w:w="100"/>
-              <w:bottom w:type="dxa" w:w="70"/>
-              <w:right w:type="dxa" w:w="100"/>
-            </w:tcMar>
-          </w:tcPr>
-          <w:p>
-            <w:pPr>
-              <w:spacing w:after="0" w:line="252"/>
-            </w:pPr>
-            <w:r>
-              <w:rPr>
-                <w:rFonts w:ascii="Calibri" w:cs="Calibri" w:eastAsia="Calibri" w:hAnsi="Calibri"/>
-                <w:b w:val="false"/>
-                <w:bCs w:val="false"/>
-                <w:color w:val="0C0E13"/>
-                <w:sz w:val="16"/>
-                <w:szCs w:val="16"/>
-              </w:rPr>
-              <w:t xml:space="preserve">N3</w:t>
-            </w:r>
-          </w:p>
-        </w:tc>
-        <w:tc>
-          <w:tcPr>
-            <w:tcW w:type="dxa" w:w="2200"/>
-            <w:tcBorders>
-              <w:top w:val="single" w:color="D9D5CB" w:sz="4"/>
-              <w:left w:val="single" w:color="D9D5CB" w:sz="4"/>
-              <w:bottom w:val="single" w:color="D9D5CB" w:sz="4"/>
-              <w:right w:val="single" w:color="D9D5CB" w:sz="4"/>
-            </w:tcBorders>
-            <w:tcMar>
-              <w:top w:type="dxa" w:w="70"/>
-              <w:left w:type="dxa" w:w="100"/>
-              <w:bottom w:type="dxa" w:w="70"/>
-              <w:right w:type="dxa" w:w="100"/>
-            </w:tcMar>
-          </w:tcPr>
-          <w:p>
-            <w:pPr>
-              <w:spacing w:after="0" w:line="252"/>
-            </w:pPr>
-            <w:r>
-              <w:rPr>
-                <w:rFonts w:ascii="Calibri" w:cs="Calibri" w:eastAsia="Calibri" w:hAnsi="Calibri"/>
-                <w:b w:val="false"/>
-                <w:bCs w:val="false"/>
-                <w:color w:val="0C0E13"/>
-                <w:sz w:val="16"/>
-                <w:szCs w:val="16"/>
-              </w:rPr>
-              <w:t xml:space="preserve">Gate output is unbounded when many files change</w:t>
-            </w:r>
-          </w:p>
-        </w:tc>
-        <w:tc>
-          <w:tcPr>
-            <w:tcW w:type="dxa" w:w="3000"/>
-            <w:tcBorders>
-              <w:top w:val="single" w:color="D9D5CB" w:sz="4"/>
-              <w:left w:val="single" w:color="D9D5CB" w:sz="4"/>
-              <w:bottom w:val="single" w:color="D9D5CB" w:sz="4"/>
-              <w:right w:val="single" w:color="D9D5CB" w:sz="4"/>
-            </w:tcBorders>
-            <w:tcMar>
-              <w:top w:type="dxa" w:w="70"/>
-              <w:left w:type="dxa" w:w="100"/>
-              <w:bottom w:type="dxa" w:w="70"/>
-              <w:right w:type="dxa" w:w="100"/>
-            </w:tcMar>
-          </w:tcPr>
-          <w:p>
-            <w:pPr>
-              <w:spacing w:after="0" w:line="252"/>
-            </w:pPr>
-            <w:r>
-              <w:rPr>
-                <w:rFonts w:ascii="Calibri" w:cs="Calibri" w:eastAsia="Calibri" w:hAnsi="Calibri"/>
-                <w:b w:val="false"/>
-                <w:bCs w:val="false"/>
-                <w:color w:val="0C0E13"/>
-                <w:sz w:val="16"/>
-                <w:szCs w:val="16"/>
-              </w:rPr>
-              <w:t xml:space="preserve">1,000 new untracked files produced 1,000 findings, about 15,052 tokens for `resume --check`. Typical runs are a median 65 tokens.</w:t>
-            </w:r>
-          </w:p>
-        </w:tc>
-        <w:tc>
-          <w:tcPr>
-            <w:tcW w:type="dxa" w:w="2600"/>
-            <w:tcBorders>
-              <w:top w:val="single" w:color="D9D5CB" w:sz="4"/>
-              <w:left w:val="single" w:color="D9D5CB" w:sz="4"/>
-              <w:bottom w:val="single" w:color="D9D5CB" w:sz="4"/>
-              <w:right w:val="single" w:color="D9D5CB" w:sz="4"/>
-            </w:tcBorders>
-            <w:tcMar>
-              <w:top w:type="dxa" w:w="70"/>
-              <w:left w:type="dxa" w:w="100"/>
-              <w:bottom w:type="dxa" w:w="70"/>
-              <w:right w:type="dxa" w:w="100"/>
-            </w:tcMar>
-          </w:tcPr>
-          <w:p>
-            <w:pPr>
-              <w:spacing w:after="0" w:line="252"/>
-            </w:pPr>
-            <w:r>
-              <w:rPr>
-                <w:rFonts w:ascii="Calibri" w:cs="Calibri" w:eastAsia="Calibri" w:hAnsi="Calibri"/>
-                <w:b w:val="false"/>
-                <w:bCs w:val="false"/>
-                <w:color w:val="0C0E13"/>
-                <w:sz w:val="16"/>
-                <w:szCs w:val="16"/>
-              </w:rPr>
-              <w:t xml:space="preserve">Summarize repeated findings: show the first few and a count, as the gate already does for unverified claims.</w:t>
-            </w:r>
-          </w:p>
-        </w:tc>
-        <w:tc>
-          <w:tcPr>
-            <w:tcW w:type="dxa" w:w="1040"/>
-            <w:tcBorders>
-              <w:top w:val="single" w:color="D9D5CB" w:sz="4"/>
-              <w:left w:val="single" w:color="D9D5CB" w:sz="4"/>
-              <w:bottom w:val="single" w:color="D9D5CB" w:sz="4"/>
-              <w:right w:val="single" w:color="D9D5CB" w:sz="4"/>
-            </w:tcBorders>
-            <w:tcMar>
-              <w:top w:type="dxa" w:w="70"/>
-              <w:left w:type="dxa" w:w="100"/>
-              <w:bottom w:type="dxa" w:w="70"/>
-              <w:right w:type="dxa" w:w="100"/>
-            </w:tcMar>
-          </w:tcPr>
-          <w:p>
-            <w:pPr>
-              <w:spacing w:after="0" w:line="252"/>
-            </w:pPr>
-            <w:r>
-              <w:rPr>
-                <w:rFonts w:ascii="Calibri" w:cs="Calibri" w:eastAsia="Calibri" w:hAnsi="Calibri"/>
-                <w:b w:val="false"/>
-                <w:bCs w:val="false"/>
-                <w:color w:val="0C0E13"/>
-                <w:sz w:val="16"/>
-                <w:szCs w:val="16"/>
-              </w:rPr>
-              <w:t xml:space="preserve">low</w:t>
-            </w:r>
-          </w:p>
-        </w:tc>
-      </w:tr>
-      <w:tr>
-        <w:trPr>
-          <w:cantSplit/>
-        </w:trPr>
-        <w:tc>
-          <w:tcPr>
-            <w:tcW w:type="dxa" w:w="520"/>
-            <w:tcBorders>
-              <w:top w:val="single" w:color="D9D5CB" w:sz="4"/>
-              <w:left w:val="single" w:color="D9D5CB" w:sz="4"/>
-              <w:bottom w:val="single" w:color="D9D5CB" w:sz="4"/>
-              <w:right w:val="single" w:color="D9D5CB" w:sz="4"/>
-            </w:tcBorders>
-            <w:tcMar>
-              <w:top w:type="dxa" w:w="70"/>
-              <w:left w:type="dxa" w:w="100"/>
-              <w:bottom w:type="dxa" w:w="70"/>
-              <w:right w:type="dxa" w:w="100"/>
-            </w:tcMar>
-          </w:tcPr>
-          <w:p>
-            <w:pPr>
-              <w:spacing w:after="0" w:line="252"/>
-            </w:pPr>
-            <w:r>
-              <w:rPr>
-                <w:rFonts w:ascii="Calibri" w:cs="Calibri" w:eastAsia="Calibri" w:hAnsi="Calibri"/>
-                <w:b w:val="false"/>
-                <w:bCs w:val="false"/>
-                <w:color w:val="0C0E13"/>
-                <w:sz w:val="16"/>
-                <w:szCs w:val="16"/>
-              </w:rPr>
-              <w:t xml:space="preserve">N4</w:t>
-            </w:r>
-          </w:p>
-        </w:tc>
-        <w:tc>
-          <w:tcPr>
-            <w:tcW w:type="dxa" w:w="2200"/>
-            <w:tcBorders>
-              <w:top w:val="single" w:color="D9D5CB" w:sz="4"/>
-              <w:left w:val="single" w:color="D9D5CB" w:sz="4"/>
-              <w:bottom w:val="single" w:color="D9D5CB" w:sz="4"/>
-              <w:right w:val="single" w:color="D9D5CB" w:sz="4"/>
-            </w:tcBorders>
-            <w:tcMar>
-              <w:top w:type="dxa" w:w="70"/>
-              <w:left w:type="dxa" w:w="100"/>
-              <w:bottom w:type="dxa" w:w="70"/>
-              <w:right w:type="dxa" w:w="100"/>
-            </w:tcMar>
-          </w:tcPr>
-          <w:p>
-            <w:pPr>
-              <w:spacing w:after="0" w:line="252"/>
-            </w:pPr>
-            <w:r>
-              <w:rPr>
-                <w:rFonts w:ascii="Calibri" w:cs="Calibri" w:eastAsia="Calibri" w:hAnsi="Calibri"/>
-                <w:b w:val="false"/>
-                <w:bCs w:val="false"/>
-                <w:color w:val="0C0E13"/>
-                <w:sz w:val="16"/>
-                <w:szCs w:val="16"/>
-              </w:rPr>
-              <w:t xml:space="preserve">`git stash -u` and `git clean -fd` delete untracked notes</w:t>
-            </w:r>
-          </w:p>
-        </w:tc>
-        <w:tc>
-          <w:tcPr>
-            <w:tcW w:type="dxa" w:w="3000"/>
-            <w:tcBorders>
-              <w:top w:val="single" w:color="D9D5CB" w:sz="4"/>
-              <w:left w:val="single" w:color="D9D5CB" w:sz="4"/>
-              <w:bottom w:val="single" w:color="D9D5CB" w:sz="4"/>
-              <w:right w:val="single" w:color="D9D5CB" w:sz="4"/>
-            </w:tcBorders>
-            <w:tcMar>
-              <w:top w:type="dxa" w:w="70"/>
-              <w:left w:type="dxa" w:w="100"/>
-              <w:bottom w:type="dxa" w:w="70"/>
-              <w:right w:type="dxa" w:w="100"/>
-            </w:tcMar>
-          </w:tcPr>
-          <w:p>
-            <w:pPr>
-              <w:spacing w:after="0" w:line="252"/>
-            </w:pPr>
-            <w:r>
-              <w:rPr>
-                <w:rFonts w:ascii="Calibri" w:cs="Calibri" w:eastAsia="Calibri" w:hAnsi="Calibri"/>
-                <w:b w:val="false"/>
-                <w:bCs w:val="false"/>
-                <w:color w:val="0C0E13"/>
-                <w:sz w:val="16"/>
-                <w:szCs w:val="16"/>
-              </w:rPr>
-              <w:t xml:space="preserve">Both commands removed the untracked contextbridge/ folder; the gate then correctly returned BLOCKED (no checkpoint). With `init --local-only` the notes survived both.</w:t>
-            </w:r>
-          </w:p>
-        </w:tc>
-        <w:tc>
-          <w:tcPr>
-            <w:tcW w:type="dxa" w:w="2600"/>
-            <w:tcBorders>
-              <w:top w:val="single" w:color="D9D5CB" w:sz="4"/>
-              <w:left w:val="single" w:color="D9D5CB" w:sz="4"/>
-              <w:bottom w:val="single" w:color="D9D5CB" w:sz="4"/>
-              <w:right w:val="single" w:color="D9D5CB" w:sz="4"/>
-            </w:tcBorders>
-            <w:tcMar>
-              <w:top w:type="dxa" w:w="70"/>
-              <w:left w:type="dxa" w:w="100"/>
-              <w:bottom w:type="dxa" w:w="70"/>
-              <w:right w:type="dxa" w:w="100"/>
-            </w:tcMar>
-          </w:tcPr>
-          <w:p>
-            <w:pPr>
-              <w:spacing w:after="0" w:line="252"/>
-            </w:pPr>
-            <w:r>
-              <w:rPr>
-                <w:rFonts w:ascii="Calibri" w:cs="Calibri" w:eastAsia="Calibri" w:hAnsi="Calibri"/>
-                <w:b w:val="false"/>
-                <w:bCs w:val="false"/>
-                <w:color w:val="0C0E13"/>
-                <w:sz w:val="16"/>
-                <w:szCs w:val="16"/>
-              </w:rPr>
-              <w:t xml:space="preserve">Document it and recommend `init --local-only` or committing the notes.</w:t>
-            </w:r>
-          </w:p>
-        </w:tc>
-        <w:tc>
-          <w:tcPr>
-            <w:tcW w:type="dxa" w:w="1040"/>
-            <w:tcBorders>
-              <w:top w:val="single" w:color="D9D5CB" w:sz="4"/>
-              <w:left w:val="single" w:color="D9D5CB" w:sz="4"/>
-              <w:bottom w:val="single" w:color="D9D5CB" w:sz="4"/>
-              <w:right w:val="single" w:color="D9D5CB" w:sz="4"/>
-            </w:tcBorders>
-            <w:tcMar>
-              <w:top w:type="dxa" w:w="70"/>
-              <w:left w:type="dxa" w:w="100"/>
-              <w:bottom w:type="dxa" w:w="70"/>
-              <w:right w:type="dxa" w:w="100"/>
-            </w:tcMar>
-          </w:tcPr>
-          <w:p>
-            <w:pPr>
-              <w:spacing w:after="0" w:line="252"/>
-            </w:pPr>
-            <w:r>
-              <w:rPr>
-                <w:rFonts w:ascii="Calibri" w:cs="Calibri" w:eastAsia="Calibri" w:hAnsi="Calibri"/>
-                <w:b w:val="false"/>
-                <w:bCs w:val="false"/>
-                <w:color w:val="0C0E13"/>
-                <w:sz w:val="16"/>
-                <w:szCs w:val="16"/>
-              </w:rPr>
-              <w:t xml:space="preserve">low</w:t>
-            </w:r>
-          </w:p>
-        </w:tc>
-      </w:tr>
-      <w:tr>
-        <w:trPr>
-          <w:cantSplit/>
-        </w:trPr>
-        <w:tc>
-          <w:tcPr>
-            <w:tcW w:type="dxa" w:w="520"/>
-            <w:tcBorders>
-              <w:top w:val="single" w:color="D9D5CB" w:sz="4"/>
-              <w:left w:val="single" w:color="D9D5CB" w:sz="4"/>
-              <w:bottom w:val="single" w:color="D9D5CB" w:sz="4"/>
-              <w:right w:val="single" w:color="D9D5CB" w:sz="4"/>
-            </w:tcBorders>
-            <w:tcMar>
-              <w:top w:type="dxa" w:w="70"/>
-              <w:left w:type="dxa" w:w="100"/>
-              <w:bottom w:type="dxa" w:w="70"/>
-              <w:right w:type="dxa" w:w="100"/>
-            </w:tcMar>
-          </w:tcPr>
-          <w:p>
-            <w:pPr>
-              <w:spacing w:after="0" w:line="252"/>
-            </w:pPr>
-            <w:r>
-              <w:rPr>
-                <w:rFonts w:ascii="Calibri" w:cs="Calibri" w:eastAsia="Calibri" w:hAnsi="Calibri"/>
-                <w:b w:val="false"/>
-                <w:bCs w:val="false"/>
-                <w:color w:val="0C0E13"/>
-                <w:sz w:val="16"/>
-                <w:szCs w:val="16"/>
-              </w:rPr>
-              <w:t xml:space="preserve">N5</w:t>
-            </w:r>
-          </w:p>
-        </w:tc>
-        <w:tc>
-          <w:tcPr>
-            <w:tcW w:type="dxa" w:w="2200"/>
-            <w:tcBorders>
-              <w:top w:val="single" w:color="D9D5CB" w:sz="4"/>
-              <w:left w:val="single" w:color="D9D5CB" w:sz="4"/>
-              <w:bottom w:val="single" w:color="D9D5CB" w:sz="4"/>
-              <w:right w:val="single" w:color="D9D5CB" w:sz="4"/>
-            </w:tcBorders>
-            <w:tcMar>
-              <w:top w:type="dxa" w:w="70"/>
-              <w:left w:type="dxa" w:w="100"/>
-              <w:bottom w:type="dxa" w:w="70"/>
-              <w:right w:type="dxa" w:w="100"/>
-            </w:tcMar>
-          </w:tcPr>
-          <w:p>
-            <w:pPr>
-              <w:spacing w:after="0" w:line="252"/>
-            </w:pPr>
-            <w:r>
-              <w:rPr>
-                <w:rFonts w:ascii="Calibri" w:cs="Calibri" w:eastAsia="Calibri" w:hAnsi="Calibri"/>
-                <w:b w:val="false"/>
-                <w:bCs w:val="false"/>
-                <w:color w:val="0C0E13"/>
-                <w:sz w:val="16"/>
-                <w:szCs w:val="16"/>
-              </w:rPr>
-              <w:t xml:space="preserve">The generic secret rule flags ordinary code</w:t>
-            </w:r>
-          </w:p>
-        </w:tc>
-        <w:tc>
-          <w:tcPr>
-            <w:tcW w:type="dxa" w:w="3000"/>
-            <w:tcBorders>
-              <w:top w:val="single" w:color="D9D5CB" w:sz="4"/>
-              <w:left w:val="single" w:color="D9D5CB" w:sz="4"/>
-              <w:bottom w:val="single" w:color="D9D5CB" w:sz="4"/>
-              <w:right w:val="single" w:color="D9D5CB" w:sz="4"/>
-            </w:tcBorders>
-            <w:tcMar>
-              <w:top w:type="dxa" w:w="70"/>
-              <w:left w:type="dxa" w:w="100"/>
-              <w:bottom w:type="dxa" w:w="70"/>
-              <w:right w:type="dxa" w:w="100"/>
-            </w:tcMar>
-          </w:tcPr>
-          <w:p>
-            <w:pPr>
-              <w:spacing w:after="0" w:line="252"/>
-            </w:pPr>
-            <w:r>
-              <w:rPr>
-                <w:rFonts w:ascii="Calibri" w:cs="Calibri" w:eastAsia="Calibri" w:hAnsi="Calibri"/>
-                <w:b w:val="false"/>
-                <w:bCs w:val="false"/>
-                <w:color w:val="0C0E13"/>
-                <w:sz w:val="16"/>
-                <w:szCs w:val="16"/>
-              </w:rPr>
-              <w:t xml:space="preserve">24 lines flagged in 979,577 lines of Python stdlib (25 per million) and 59 in sampled JavaScript (78 per million), for example `token = self._fp.read(1)[0]`.</w:t>
-            </w:r>
-          </w:p>
-        </w:tc>
-        <w:tc>
-          <w:tcPr>
-            <w:tcW w:type="dxa" w:w="2600"/>
-            <w:tcBorders>
-              <w:top w:val="single" w:color="D9D5CB" w:sz="4"/>
-              <w:left w:val="single" w:color="D9D5CB" w:sz="4"/>
-              <w:bottom w:val="single" w:color="D9D5CB" w:sz="4"/>
-              <w:right w:val="single" w:color="D9D5CB" w:sz="4"/>
-            </w:tcBorders>
-            <w:tcMar>
-              <w:top w:type="dxa" w:w="70"/>
-              <w:left w:type="dxa" w:w="100"/>
-              <w:bottom w:type="dxa" w:w="70"/>
-              <w:right w:type="dxa" w:w="100"/>
-            </w:tcMar>
-          </w:tcPr>
-          <w:p>
-            <w:pPr>
-              <w:spacing w:after="0" w:line="252"/>
-            </w:pPr>
-            <w:r>
-              <w:rPr>
-                <w:rFonts w:ascii="Calibri" w:cs="Calibri" w:eastAsia="Calibri" w:hAnsi="Calibri"/>
-                <w:b w:val="false"/>
-                <w:bCs w:val="false"/>
-                <w:color w:val="0C0E13"/>
-                <w:sz w:val="16"/>
-                <w:szCs w:val="16"/>
-              </w:rPr>
-              <w:t xml:space="preserve">Ignore right-hand sides that are calls or attribute lookups; keep the rule strict for quoted literals.</w:t>
-            </w:r>
-          </w:p>
-        </w:tc>
-        <w:tc>
-          <w:tcPr>
-            <w:tcW w:type="dxa" w:w="1040"/>
-            <w:tcBorders>
-              <w:top w:val="single" w:color="D9D5CB" w:sz="4"/>
-              <w:left w:val="single" w:color="D9D5CB" w:sz="4"/>
-              <w:bottom w:val="single" w:color="D9D5CB" w:sz="4"/>
-              <w:right w:val="single" w:color="D9D5CB" w:sz="4"/>
-            </w:tcBorders>
-            <w:tcMar>
-              <w:top w:type="dxa" w:w="70"/>
-              <w:left w:type="dxa" w:w="100"/>
-              <w:bottom w:type="dxa" w:w="70"/>
-              <w:right w:type="dxa" w:w="100"/>
-            </w:tcMar>
-          </w:tcPr>
-          <w:p>
-            <w:pPr>
-              <w:spacing w:after="0" w:line="252"/>
-            </w:pPr>
-            <w:r>
-              <w:rPr>
-                <w:rFonts w:ascii="Calibri" w:cs="Calibri" w:eastAsia="Calibri" w:hAnsi="Calibri"/>
-                <w:b w:val="false"/>
-                <w:bCs w:val="false"/>
-                <w:color w:val="0C0E13"/>
-                <w:sz w:val="16"/>
-                <w:szCs w:val="16"/>
-              </w:rPr>
-              <w:t xml:space="preserve">low</w:t>
-            </w:r>
-          </w:p>
-        </w:tc>
-      </w:tr>
-      <w:tr>
-        <w:trPr>
-          <w:cantSplit/>
-        </w:trPr>
-        <w:tc>
-          <w:tcPr>
-            <w:tcW w:type="dxa" w:w="520"/>
-            <w:tcBorders>
-              <w:top w:val="single" w:color="D9D5CB" w:sz="4"/>
-              <w:left w:val="single" w:color="D9D5CB" w:sz="4"/>
-              <w:bottom w:val="single" w:color="D9D5CB" w:sz="4"/>
-              <w:right w:val="single" w:color="D9D5CB" w:sz="4"/>
-            </w:tcBorders>
-            <w:tcMar>
-              <w:top w:type="dxa" w:w="70"/>
-              <w:left w:type="dxa" w:w="100"/>
-              <w:bottom w:type="dxa" w:w="70"/>
-              <w:right w:type="dxa" w:w="100"/>
-            </w:tcMar>
-          </w:tcPr>
-          <w:p>
-            <w:pPr>
-              <w:spacing w:after="0" w:line="252"/>
-            </w:pPr>
-            <w:r>
-              <w:rPr>
-                <w:rFonts w:ascii="Calibri" w:cs="Calibri" w:eastAsia="Calibri" w:hAnsi="Calibri"/>
-                <w:b w:val="false"/>
-                <w:bCs w:val="false"/>
-                <w:color w:val="0C0E13"/>
-                <w:sz w:val="16"/>
-                <w:szCs w:val="16"/>
-              </w:rPr>
-              <w:t xml:space="preserve">N6</w:t>
-            </w:r>
-          </w:p>
-        </w:tc>
-        <w:tc>
-          <w:tcPr>
-            <w:tcW w:type="dxa" w:w="2200"/>
-            <w:tcBorders>
-              <w:top w:val="single" w:color="D9D5CB" w:sz="4"/>
-              <w:left w:val="single" w:color="D9D5CB" w:sz="4"/>
-              <w:bottom w:val="single" w:color="D9D5CB" w:sz="4"/>
-              <w:right w:val="single" w:color="D9D5CB" w:sz="4"/>
-            </w:tcBorders>
-            <w:tcMar>
-              <w:top w:type="dxa" w:w="70"/>
-              <w:left w:type="dxa" w:w="100"/>
-              <w:bottom w:type="dxa" w:w="70"/>
-              <w:right w:type="dxa" w:w="100"/>
-            </w:tcMar>
-          </w:tcPr>
-          <w:p>
-            <w:pPr>
-              <w:spacing w:after="0" w:line="252"/>
-            </w:pPr>
-            <w:r>
-              <w:rPr>
-                <w:rFonts w:ascii="Calibri" w:cs="Calibri" w:eastAsia="Calibri" w:hAnsi="Calibri"/>
-                <w:b w:val="false"/>
-                <w:bCs w:val="false"/>
-                <w:color w:val="0C0E13"/>
-                <w:sz w:val="16"/>
-                <w:szCs w:val="16"/>
-              </w:rPr>
-              <w:t xml:space="preserve">Scanner has no pattern for several common key formats</w:t>
-            </w:r>
-          </w:p>
-        </w:tc>
-        <w:tc>
-          <w:tcPr>
-            <w:tcW w:type="dxa" w:w="3000"/>
-            <w:tcBorders>
-              <w:top w:val="single" w:color="D9D5CB" w:sz="4"/>
-              <w:left w:val="single" w:color="D9D5CB" w:sz="4"/>
-              <w:bottom w:val="single" w:color="D9D5CB" w:sz="4"/>
-              <w:right w:val="single" w:color="D9D5CB" w:sz="4"/>
-            </w:tcBorders>
-            <w:tcMar>
-              <w:top w:type="dxa" w:w="70"/>
-              <w:left w:type="dxa" w:w="100"/>
-              <w:bottom w:type="dxa" w:w="70"/>
-              <w:right w:type="dxa" w:w="100"/>
-            </w:tcMar>
-          </w:tcPr>
-          <w:p>
-            <w:pPr>
-              <w:spacing w:after="0" w:line="252"/>
-            </w:pPr>
-            <w:r>
-              <w:rPr>
-                <w:rFonts w:ascii="Calibri" w:cs="Calibri" w:eastAsia="Calibri" w:hAnsi="Calibri"/>
-                <w:b w:val="false"/>
-                <w:bCs w:val="false"/>
-                <w:color w:val="0C0E13"/>
-                <w:sz w:val="16"/>
-                <w:szCs w:val="16"/>
-              </w:rPr>
-              <w:t xml:space="preserve">9 of 9 uncovered formats (Telegram, Shopify, DigitalOcean, Mailchimp, bare hex and base64 secrets…) are never flagged, by design for the entropy-only ones.</w:t>
-            </w:r>
-          </w:p>
-        </w:tc>
-        <w:tc>
-          <w:tcPr>
-            <w:tcW w:type="dxa" w:w="2600"/>
-            <w:tcBorders>
-              <w:top w:val="single" w:color="D9D5CB" w:sz="4"/>
-              <w:left w:val="single" w:color="D9D5CB" w:sz="4"/>
-              <w:bottom w:val="single" w:color="D9D5CB" w:sz="4"/>
-              <w:right w:val="single" w:color="D9D5CB" w:sz="4"/>
-            </w:tcBorders>
-            <w:tcMar>
-              <w:top w:type="dxa" w:w="70"/>
-              <w:left w:type="dxa" w:w="100"/>
-              <w:bottom w:type="dxa" w:w="70"/>
-              <w:right w:type="dxa" w:w="100"/>
-            </w:tcMar>
-          </w:tcPr>
-          <w:p>
-            <w:pPr>
-              <w:spacing w:after="0" w:line="252"/>
-            </w:pPr>
-            <w:r>
-              <w:rPr>
-                <w:rFonts w:ascii="Calibri" w:cs="Calibri" w:eastAsia="Calibri" w:hAnsi="Calibri"/>
-                <w:b w:val="false"/>
-                <w:bCs w:val="false"/>
-                <w:color w:val="0C0E13"/>
-                <w:sz w:val="16"/>
-                <w:szCs w:val="16"/>
-              </w:rPr>
-              <w:t xml:space="preserve">Add dedicated patterns for vendor-prefixed formats; keep the best-effort wording.</w:t>
-            </w:r>
-          </w:p>
-        </w:tc>
-        <w:tc>
-          <w:tcPr>
-            <w:tcW w:type="dxa" w:w="1040"/>
-            <w:tcBorders>
-              <w:top w:val="single" w:color="D9D5CB" w:sz="4"/>
-              <w:left w:val="single" w:color="D9D5CB" w:sz="4"/>
-              <w:bottom w:val="single" w:color="D9D5CB" w:sz="4"/>
-              <w:right w:val="single" w:color="D9D5CB" w:sz="4"/>
-            </w:tcBorders>
-            <w:tcMar>
-              <w:top w:type="dxa" w:w="70"/>
-              <w:left w:type="dxa" w:w="100"/>
-              <w:bottom w:type="dxa" w:w="70"/>
-              <w:right w:type="dxa" w:w="100"/>
-            </w:tcMar>
-          </w:tcPr>
-          <w:p>
-            <w:pPr>
-              <w:spacing w:after="0" w:line="252"/>
-            </w:pPr>
-            <w:r>
-              <w:rPr>
-                <w:rFonts w:ascii="Calibri" w:cs="Calibri" w:eastAsia="Calibri" w:hAnsi="Calibri"/>
-                <w:b w:val="false"/>
-                <w:bCs w:val="false"/>
-                <w:color w:val="0C0E13"/>
-                <w:sz w:val="16"/>
-                <w:szCs w:val="16"/>
-              </w:rPr>
-              <w:t xml:space="preserve">low</w:t>
-            </w:r>
-          </w:p>
-        </w:tc>
-      </w:tr>
-    </w:tbl>
-    <w:p>
-      <w:pPr>
-        <w:spacing w:after="140" w:line="288"/>
-      </w:pPr>
-      <w:r>
-        <w:rPr>
-          <w:rFonts w:ascii="Calibri" w:cs="Calibri" w:eastAsia="Calibri" w:hAnsi="Calibri"/>
-          <w:color w:val="666B78"/>
-          <w:sz w:val="20"/>
-          <w:szCs w:val="20"/>
-        </w:rPr>
-        <w:t xml:space="preserve">Earlier rounds (version string, nested repositories, scanner formats, unbounded handoff, status crash) were fixed in 0.3.2 and are re-tested here.</w:t>
-      </w:r>
-    </w:p>
-    <w:p>
-      <w:pPr>
-        <w:pStyle w:val="Heading1"/>
-      </w:pPr>
-      <w:r>
-        <w:t xml:space="preserve">8. Reproduce</w:t>
+        <w:t xml:space="preserve">7. Reproduce</w:t>
       </w:r>
     </w:p>
     <w:p>
@@ -28173,7 +27391,7 @@
                 <w:sz w:val="15"/>
                 <w:szCs w:val="15"/>
               </w:rPr>
-              <w:t xml:space="preserve">crash</w:t>
+              <w:t xml:space="preserve">BLOCKED</w:t>
             </w:r>
           </w:p>
         </w:tc>
@@ -28206,7 +27424,7 @@
                 <w:sz w:val="15"/>
                 <w:szCs w:val="15"/>
               </w:rPr>
-              <w:t xml:space="preserve">MISS</w:t>
+              <w:t xml:space="preserve">ok</w:t>
             </w:r>
           </w:p>
         </w:tc>

</xml_diff>